<commit_message>
change path + remove smell
</commit_message>
<xml_diff>
--- a/NEWDOCUMENTATION.docx
+++ b/NEWDOCUMENTATION.docx
@@ -42,6 +42,9 @@
         </w:rPr>
       </w:pPr>
       <w:commentRangeStart w:id="0"/>
+      <w:commentRangeStart w:id="1"/>
+      <w:commentRangeStart w:id="2"/>
+      <w:commentRangeStart w:id="3"/>
       <w:r>
         <w:rPr>
           <w:b/>
@@ -62,6 +65,36 @@
           <w:lang w:val="en-GB"/>
         </w:rPr>
         <w:commentReference w:id="0"/>
+      </w:r>
+      <w:commentRangeEnd w:id="1"/>
+      <w:r>
+        <w:rPr>
+          <w:rStyle w:val="CommentReference"/>
+          <w:sz w:val="22"/>
+          <w:szCs w:val="22"/>
+          <w:lang w:val="en-GB"/>
+        </w:rPr>
+        <w:commentReference w:id="1"/>
+      </w:r>
+      <w:commentRangeEnd w:id="2"/>
+      <w:r>
+        <w:rPr>
+          <w:rStyle w:val="CommentReference"/>
+          <w:sz w:val="22"/>
+          <w:szCs w:val="22"/>
+          <w:lang w:val="en-GB"/>
+        </w:rPr>
+        <w:commentReference w:id="2"/>
+      </w:r>
+      <w:commentRangeEnd w:id="3"/>
+      <w:r>
+        <w:rPr>
+          <w:rStyle w:val="CommentReference"/>
+          <w:sz w:val="22"/>
+          <w:szCs w:val="22"/>
+          <w:lang w:val="en-GB"/>
+        </w:rPr>
+        <w:commentReference w:id="3"/>
       </w:r>
     </w:p>
     <w:p>
@@ -1446,7 +1479,7 @@
             <w:pPr>
               <w:jc w:val="center"/>
             </w:pPr>
-            <w:commentRangeStart w:id="1"/>
+            <w:commentRangeStart w:id="4"/>
             <w:r>
               <w:rPr>
                 <w:b/>
@@ -1455,14 +1488,14 @@
               </w:rPr>
               <w:t>Component</w:t>
             </w:r>
-            <w:commentRangeEnd w:id="1"/>
+            <w:commentRangeEnd w:id="4"/>
             <w:r>
               <w:rPr>
                 <w:rStyle w:val="CommentReference"/>
                 <w:sz w:val="22"/>
                 <w:szCs w:val="22"/>
               </w:rPr>
-              <w:commentReference w:id="1"/>
+              <w:commentReference w:id="4"/>
             </w:r>
           </w:p>
         </w:tc>
@@ -2362,18 +2395,18 @@
             <w:r>
               <w:t xml:space="preserve">1 GB </w:t>
             </w:r>
-            <w:commentRangeStart w:id="2"/>
+            <w:commentRangeStart w:id="5"/>
             <w:r>
               <w:t>(including Docker image)</w:t>
             </w:r>
-            <w:commentRangeEnd w:id="2"/>
+            <w:commentRangeEnd w:id="5"/>
             <w:r>
               <w:rPr>
                 <w:rStyle w:val="CommentReference"/>
                 <w:sz w:val="22"/>
                 <w:szCs w:val="22"/>
               </w:rPr>
-              <w:commentReference w:id="2"/>
+              <w:commentReference w:id="5"/>
             </w:r>
           </w:p>
         </w:tc>
@@ -3122,14 +3155,14 @@
         </w:rPr>
         <w:t>As a restaurant manager, I want to view all historical orders with their associated financial data</w:t>
       </w:r>
-      <w:commentRangeStart w:id="3"/>
+      <w:commentRangeStart w:id="6"/>
       <w:r>
         <w:rPr>
           <w:lang w:val="en-GB"/>
         </w:rPr>
         <w:t>, filtered by time range and status</w:t>
       </w:r>
-      <w:commentRangeEnd w:id="3"/>
+      <w:commentRangeEnd w:id="6"/>
       <w:r>
         <w:rPr>
           <w:rStyle w:val="CommentReference"/>
@@ -3137,7 +3170,7 @@
           <w:szCs w:val="22"/>
           <w:lang w:val="en-GB"/>
         </w:rPr>
-        <w:commentReference w:id="3"/>
+        <w:commentReference w:id="6"/>
       </w:r>
       <w:r>
         <w:rPr>
@@ -3428,14 +3461,14 @@
         </w:rPr>
         <w:t xml:space="preserve">As a cashier, I want to calculate the total bill for a table, </w:t>
       </w:r>
-      <w:commentRangeStart w:id="4"/>
+      <w:commentRangeStart w:id="7"/>
       <w:r>
         <w:rPr>
           <w:lang w:val="en-GB"/>
         </w:rPr>
         <w:t>apply an optional discount and close the orde</w:t>
       </w:r>
-      <w:commentRangeEnd w:id="4"/>
+      <w:commentRangeEnd w:id="7"/>
       <w:r>
         <w:rPr>
           <w:rStyle w:val="CommentReference"/>
@@ -3443,7 +3476,7 @@
           <w:szCs w:val="22"/>
           <w:lang w:val="en-GB"/>
         </w:rPr>
-        <w:commentReference w:id="4"/>
+        <w:commentReference w:id="7"/>
       </w:r>
       <w:r>
         <w:rPr>
@@ -3476,7 +3509,20 @@
       </w:pPr>
       <w:r>
         <w:lastRenderedPageBreak/>
-        <w:t>1.3 FUNCTIONAL REQUIREMENTS</w:t>
+        <w:t xml:space="preserve">1.3 </w:t>
+      </w:r>
+      <w:commentRangeStart w:id="8"/>
+      <w:r>
+        <w:t>FUNCTIONAL REQUIREMENTS</w:t>
+      </w:r>
+      <w:commentRangeEnd w:id="8"/>
+      <w:r>
+        <w:rPr>
+          <w:rStyle w:val="CommentReference"/>
+          <w:sz w:val="28"/>
+          <w:szCs w:val="28"/>
+        </w:rPr>
+        <w:commentReference w:id="8"/>
       </w:r>
     </w:p>
     <w:p>
@@ -3526,14 +3572,14 @@
         </w:rPr>
         <w:t xml:space="preserve">FR-2: </w:t>
       </w:r>
-      <w:commentRangeStart w:id="5"/>
+      <w:commentRangeStart w:id="9"/>
       <w:r>
         <w:rPr>
           <w:lang w:val="en-GB"/>
         </w:rPr>
         <w:t>The system shall notify all subscribed client components of order creation and status updates.</w:t>
       </w:r>
-      <w:commentRangeEnd w:id="5"/>
+      <w:commentRangeEnd w:id="9"/>
       <w:r>
         <w:rPr>
           <w:rStyle w:val="CommentReference"/>
@@ -3541,7 +3587,7 @@
           <w:szCs w:val="22"/>
           <w:lang w:val="en-GB"/>
         </w:rPr>
-        <w:commentReference w:id="5"/>
+        <w:commentReference w:id="9"/>
       </w:r>
     </w:p>
     <w:p>
@@ -3684,7 +3730,7 @@
         </w:rPr>
         <w:t>FR-7</w:t>
       </w:r>
-      <w:commentRangeStart w:id="6"/>
+      <w:commentRangeStart w:id="10"/>
       <w:r>
         <w:rPr>
           <w:b/>
@@ -3699,7 +3745,7 @@
         </w:rPr>
         <w:t>The system shall enforce role-based access control, ensuring that each authenticated user can only access the functionalities authorized for the corresponding role</w:t>
       </w:r>
-      <w:commentRangeEnd w:id="6"/>
+      <w:commentRangeEnd w:id="10"/>
       <w:r>
         <w:rPr>
           <w:rStyle w:val="CommentReference"/>
@@ -3707,7 +3753,7 @@
           <w:szCs w:val="22"/>
           <w:lang w:val="en-GB"/>
         </w:rPr>
-        <w:commentReference w:id="6"/>
+        <w:commentReference w:id="10"/>
       </w:r>
       <w:r>
         <w:rPr>
@@ -3755,8 +3801,8 @@
       <w:pPr>
         <w:pStyle w:val="Heading3"/>
       </w:pPr>
-      <w:commentRangeStart w:id="7"/>
-      <w:commentRangeStart w:id="8"/>
+      <w:commentRangeStart w:id="11"/>
+      <w:commentRangeStart w:id="12"/>
       <w:r>
         <w:rPr>
           <w:noProof/>
@@ -3803,23 +3849,23 @@
           </wp:inline>
         </w:drawing>
       </w:r>
-      <w:commentRangeEnd w:id="7"/>
+      <w:commentRangeEnd w:id="11"/>
       <w:r>
         <w:rPr>
           <w:rStyle w:val="CommentReference"/>
           <w:sz w:val="24"/>
           <w:szCs w:val="24"/>
         </w:rPr>
-        <w:commentReference w:id="7"/>
-      </w:r>
-      <w:commentRangeEnd w:id="8"/>
+        <w:commentReference w:id="11"/>
+      </w:r>
+      <w:commentRangeEnd w:id="12"/>
       <w:r>
         <w:rPr>
           <w:rStyle w:val="CommentReference"/>
           <w:sz w:val="24"/>
           <w:szCs w:val="24"/>
         </w:rPr>
-        <w:commentReference w:id="8"/>
+        <w:commentReference w:id="12"/>
       </w:r>
     </w:p>
     <w:p>
@@ -4648,14 +4694,14 @@
           <w:lang w:val="en-GB"/>
         </w:rPr>
       </w:pPr>
-      <w:commentRangeStart w:id="9"/>
+      <w:commentRangeStart w:id="13"/>
       <w:r>
         <w:rPr>
           <w:lang w:val="en-GB"/>
         </w:rPr>
         <w:t>The manager optionally applies filters (time range, status).</w:t>
       </w:r>
-      <w:commentRangeEnd w:id="9"/>
+      <w:commentRangeEnd w:id="13"/>
       <w:r>
         <w:rPr>
           <w:rStyle w:val="CommentReference"/>
@@ -4663,7 +4709,7 @@
           <w:szCs w:val="22"/>
           <w:lang w:val="en-GB"/>
         </w:rPr>
-        <w:commentReference w:id="9"/>
+        <w:commentReference w:id="13"/>
       </w:r>
     </w:p>
     <w:p>
@@ -4777,14 +4823,14 @@
           <w:lang w:val="en-GB"/>
         </w:rPr>
       </w:pPr>
-      <w:commentRangeStart w:id="10"/>
+      <w:commentRangeStart w:id="14"/>
       <w:r>
         <w:rPr>
           <w:lang w:val="en-GB"/>
         </w:rPr>
         <w:t>The cashier optionally applies a discount.</w:t>
       </w:r>
-      <w:commentRangeEnd w:id="10"/>
+      <w:commentRangeEnd w:id="14"/>
       <w:r>
         <w:rPr>
           <w:rStyle w:val="CommentReference"/>
@@ -4792,7 +4838,7 @@
           <w:szCs w:val="22"/>
           <w:lang w:val="en-GB"/>
         </w:rPr>
-        <w:commentReference w:id="10"/>
+        <w:commentReference w:id="14"/>
       </w:r>
     </w:p>
     <w:p>
@@ -4996,20 +5042,94 @@
           <w:lang w:val="en-GB"/>
         </w:rPr>
       </w:pPr>
-      <w:commentRangeStart w:id="11"/>
       <w:r>
         <w:rPr>
           <w:noProof/>
-          <w:lang w:val="en-GB"/>
         </w:rPr>
         <w:drawing>
-          <wp:anchor distT="0" distB="0" distL="114300" distR="114300" simplePos="0" relativeHeight="251658240" behindDoc="1" locked="0" layoutInCell="1" allowOverlap="1" wp14:anchorId="4D251EC9" wp14:editId="1ECBBF51">
+          <wp:anchor distT="0" distB="0" distL="114300" distR="114300" simplePos="0" relativeHeight="251660288" behindDoc="1" locked="1" layoutInCell="1" allowOverlap="1" wp14:anchorId="42035202" wp14:editId="5EAA57F9">
             <wp:simplePos x="0" y="0"/>
             <wp:positionH relativeFrom="column">
-              <wp:posOffset>-214745</wp:posOffset>
+              <wp:posOffset>-215265</wp:posOffset>
+            </wp:positionH>
+            <wp:positionV relativeFrom="page">
+              <wp:posOffset>4705350</wp:posOffset>
+            </wp:positionV>
+            <wp:extent cx="6614795" cy="5403850"/>
+            <wp:effectExtent l="19050" t="0" r="0" b="0"/>
+            <wp:wrapNone/>
+            <wp:docPr id="1071546346" name="Picture 13" descr="A screenshot of a computer&#10;&#10;AI-generated content may be incorrect."/>
+            <wp:cNvGraphicFramePr>
+              <a:graphicFrameLocks xmlns:a="http://schemas.openxmlformats.org/drawingml/2006/main" noChangeAspect="1"/>
+            </wp:cNvGraphicFramePr>
+            <a:graphic xmlns:a="http://schemas.openxmlformats.org/drawingml/2006/main">
+              <a:graphicData uri="http://schemas.openxmlformats.org/drawingml/2006/picture">
+                <pic:pic xmlns:pic="http://schemas.openxmlformats.org/drawingml/2006/picture">
+                  <pic:nvPicPr>
+                    <pic:cNvPr id="1071546346" name="Picture 13" descr="A screenshot of a computer&#10;&#10;AI-generated content may be incorrect."/>
+                    <pic:cNvPicPr>
+                      <a:picLocks noChangeAspect="1" noChangeArrowheads="1"/>
+                    </pic:cNvPicPr>
+                  </pic:nvPicPr>
+                  <pic:blipFill>
+                    <a:blip r:embed="rId12" cstate="print">
+                      <a:extLst>
+                        <a:ext uri="{28A0092B-C50C-407E-A947-70E740481C1C}">
+                          <a14:useLocalDpi xmlns:a14="http://schemas.microsoft.com/office/drawing/2010/main" val="0"/>
+                        </a:ext>
+                      </a:extLst>
+                    </a:blip>
+                    <a:srcRect/>
+                    <a:stretch>
+                      <a:fillRect/>
+                    </a:stretch>
+                  </pic:blipFill>
+                  <pic:spPr bwMode="auto">
+                    <a:xfrm>
+                      <a:off x="0" y="0"/>
+                      <a:ext cx="6614795" cy="5403850"/>
+                    </a:xfrm>
+                    <a:prstGeom prst="rect">
+                      <a:avLst/>
+                    </a:prstGeom>
+                    <a:noFill/>
+                    <a:ln>
+                      <a:noFill/>
+                    </a:ln>
+                    <a:effectLst>
+                      <a:outerShdw blurRad="50800" dist="38100" dir="5400000" algn="t" rotWithShape="0">
+                        <a:prstClr val="black">
+                          <a:alpha val="40000"/>
+                        </a:prstClr>
+                      </a:outerShdw>
+                    </a:effectLst>
+                  </pic:spPr>
+                </pic:pic>
+              </a:graphicData>
+            </a:graphic>
+            <wp14:sizeRelH relativeFrom="margin">
+              <wp14:pctWidth>0</wp14:pctWidth>
+            </wp14:sizeRelH>
+            <wp14:sizeRelV relativeFrom="margin">
+              <wp14:pctHeight>0</wp14:pctHeight>
+            </wp14:sizeRelV>
+          </wp:anchor>
+        </w:drawing>
+      </w:r>
+      <w:commentRangeStart w:id="15"/>
+      <w:r>
+        <w:rPr>
+          <w:noProof/>
+          <w:lang w:val="en-GB"/>
+        </w:rPr>
+        <w:drawing>
+          <wp:anchor distT="0" distB="0" distL="114300" distR="114300" simplePos="0" relativeHeight="251658240" behindDoc="1" locked="0" layoutInCell="1" allowOverlap="1" wp14:anchorId="4D251EC9" wp14:editId="27098F91">
+            <wp:simplePos x="0" y="0"/>
+            <wp:positionH relativeFrom="column">
+              <wp:posOffset>-214609</wp:posOffset>
             </wp:positionH>
             <wp:positionV relativeFrom="paragraph">
-              <wp:posOffset>51608</wp:posOffset>
+              <wp:posOffset>88011</wp:posOffset>
             </wp:positionV>
             <wp:extent cx="6554743" cy="5153891"/>
             <wp:effectExtent l="0" t="0" r="0" b="8890"/>
@@ -5026,7 +5146,7 @@
                     <pic:cNvPicPr/>
                   </pic:nvPicPr>
                   <pic:blipFill>
-                    <a:blip r:embed="rId12">
+                    <a:blip r:embed="rId13">
                       <a:extLst>
                         <a:ext uri="{28A0092B-C50C-407E-A947-70E740481C1C}">
                           <a14:useLocalDpi xmlns:a14="http://schemas.microsoft.com/office/drawing/2010/main" val="0"/>
@@ -5040,7 +5160,7 @@
                   <pic:spPr>
                     <a:xfrm>
                       <a:off x="0" y="0"/>
-                      <a:ext cx="6564358" cy="5161451"/>
+                      <a:ext cx="6554743" cy="5153891"/>
                     </a:xfrm>
                     <a:prstGeom prst="rect">
                       <a:avLst/>
@@ -5058,7 +5178,7 @@
           </wp:anchor>
         </w:drawing>
       </w:r>
-      <w:commentRangeEnd w:id="11"/>
+      <w:commentRangeEnd w:id="15"/>
       <w:r>
         <w:rPr>
           <w:rStyle w:val="CommentReference"/>
@@ -5066,7 +5186,7 @@
           <w:szCs w:val="22"/>
           <w:lang w:val="en-GB"/>
         </w:rPr>
-        <w:commentReference w:id="11"/>
+        <w:commentReference w:id="15"/>
       </w:r>
       <w:r>
         <w:rPr>
@@ -5081,6 +5201,7 @@
           <w:lang w:val="en-GB"/>
         </w:rPr>
       </w:pPr>
+      <w:commentRangeStart w:id="16"/>
       <w:r>
         <w:rPr>
           <w:lang w:val="en-GB"/>
@@ -5377,14 +5498,24 @@
         <w:contextualSpacing/>
         <w:jc w:val="both"/>
         <w:rPr>
-          <w:lang w:val="en-GB"/>
-        </w:rPr>
-      </w:pPr>
-      <w:r>
-        <w:rPr>
-          <w:lang w:val="en-GB"/>
-        </w:rPr>
-        <w:t>Il possible to go in a screen dedicated to see the order history: “financial”</w:t>
+          <w:b/>
+          <w:bCs/>
+          <w:lang w:val="en-GB"/>
+        </w:rPr>
+      </w:pPr>
+      <w:r>
+        <w:rPr>
+          <w:lang w:val="en-GB"/>
+        </w:rPr>
+        <w:t xml:space="preserve">Il possible to go in a </w:t>
+      </w:r>
+      <w:r>
+        <w:rPr>
+          <w:b/>
+          <w:bCs/>
+          <w:lang w:val="en-GB"/>
+        </w:rPr>
+        <w:t>screen dedicated to see the order history: “financial”</w:t>
       </w:r>
     </w:p>
     <w:p>
@@ -5398,11 +5529,15 @@
         <w:contextualSpacing/>
         <w:jc w:val="both"/>
         <w:rPr>
-          <w:lang w:val="en-GB"/>
-        </w:rPr>
-      </w:pPr>
-      <w:r>
-        <w:rPr>
+          <w:b/>
+          <w:bCs/>
+          <w:lang w:val="en-GB"/>
+        </w:rPr>
+      </w:pPr>
+      <w:r>
+        <w:rPr>
+          <w:b/>
+          <w:bCs/>
           <w:lang w:val="en-GB"/>
         </w:rPr>
         <w:t>See detail (“clicking” on a row)</w:t>
@@ -5418,8 +5553,16 @@
         <w:spacing w:after="160" w:line="278" w:lineRule="auto"/>
         <w:contextualSpacing/>
         <w:jc w:val="both"/>
-      </w:pPr>
-      <w:r>
+        <w:rPr>
+          <w:b/>
+          <w:bCs/>
+        </w:rPr>
+      </w:pPr>
+      <w:r>
+        <w:rPr>
+          <w:b/>
+          <w:bCs/>
+        </w:rPr>
         <w:t>Kitchen dashboard</w:t>
       </w:r>
     </w:p>
@@ -5434,17 +5577,23 @@
         <w:contextualSpacing/>
         <w:jc w:val="both"/>
         <w:rPr>
-          <w:lang w:val="en-GB"/>
-        </w:rPr>
-      </w:pPr>
-      <w:r>
-        <w:rPr>
+          <w:b/>
+          <w:bCs/>
+          <w:lang w:val="en-GB"/>
+        </w:rPr>
+      </w:pPr>
+      <w:r>
+        <w:rPr>
+          <w:b/>
+          <w:bCs/>
           <w:lang w:val="en-GB"/>
         </w:rPr>
         <w:t xml:space="preserve">Is possible to navigate to a preference screen that allows the user to choose what category of order show </w:t>
       </w:r>
       <w:r>
         <w:rPr>
+          <w:b/>
+          <w:bCs/>
           <w:color w:val="156082" w:themeColor="accent1"/>
           <w:lang w:val="en-GB"/>
         </w:rPr>
@@ -5462,11 +5611,15 @@
         <w:contextualSpacing/>
         <w:jc w:val="both"/>
         <w:rPr>
-          <w:lang w:val="en-GB"/>
-        </w:rPr>
-      </w:pPr>
-      <w:r>
-        <w:rPr>
+          <w:b/>
+          <w:bCs/>
+          <w:lang w:val="en-GB"/>
+        </w:rPr>
+      </w:pPr>
+      <w:r>
+        <w:rPr>
+          <w:b/>
+          <w:bCs/>
           <w:u w:val="single"/>
           <w:lang w:val="en-GB"/>
         </w:rPr>
@@ -5474,6 +5627,8 @@
       </w:r>
       <w:r>
         <w:rPr>
+          <w:b/>
+          <w:bCs/>
           <w:lang w:val="en-GB"/>
         </w:rPr>
         <w:t>: can see detail and close order</w:t>
@@ -5490,38 +5645,62 @@
         <w:contextualSpacing/>
         <w:jc w:val="both"/>
         <w:rPr>
-          <w:lang w:val="en-GB"/>
-        </w:rPr>
-      </w:pPr>
-      <w:r>
-        <w:rPr>
+          <w:b/>
+          <w:bCs/>
+          <w:lang w:val="en-GB"/>
+        </w:rPr>
+      </w:pPr>
+      <w:r>
+        <w:rPr>
+          <w:b/>
+          <w:bCs/>
           <w:lang w:val="en-GB"/>
         </w:rPr>
         <w:t xml:space="preserve">there in furthermore a screen dedicated to </w:t>
       </w:r>
       <w:r>
         <w:rPr>
+          <w:b/>
+          <w:bCs/>
           <w:lang w:val="en-GB"/>
         </w:rPr>
         <w:t>configuring</w:t>
       </w:r>
       <w:r>
         <w:rPr>
+          <w:b/>
+          <w:bCs/>
           <w:lang w:val="en-GB"/>
         </w:rPr>
         <w:t xml:space="preserve"> </w:t>
       </w:r>
       <w:r>
         <w:rPr>
+          <w:b/>
+          <w:bCs/>
           <w:lang w:val="en-GB"/>
         </w:rPr>
         <w:t xml:space="preserve">connection to </w:t>
       </w:r>
       <w:r>
         <w:rPr>
+          <w:b/>
+          <w:bCs/>
           <w:lang w:val="en-GB"/>
         </w:rPr>
         <w:t>DB</w:t>
+      </w:r>
+      <w:commentRangeEnd w:id="16"/>
+      <w:r>
+        <w:rPr>
+          <w:rStyle w:val="CommentReference"/>
+          <w:b/>
+          <w:bCs/>
+          <w:sz w:val="22"/>
+          <w:szCs w:val="22"/>
+          <w:lang w:val="en-GB"/>
+        </w:rPr>
+        <w:commentReference w:id="16"/>
       </w:r>
     </w:p>
     <w:p>
@@ -5690,7 +5869,7 @@
             <w:pPr>
               <w:spacing w:line="280" w:lineRule="auto"/>
             </w:pPr>
-            <w:commentRangeStart w:id="12"/>
+            <w:commentRangeStart w:id="17"/>
             <w:r>
               <w:rPr>
                 <w:b/>
@@ -5698,14 +5877,14 @@
               </w:rPr>
               <w:t>com.example.rm.app</w:t>
             </w:r>
-            <w:commentRangeEnd w:id="12"/>
+            <w:commentRangeEnd w:id="17"/>
             <w:r>
               <w:rPr>
                 <w:rStyle w:val="CommentReference"/>
                 <w:sz w:val="22"/>
                 <w:szCs w:val="22"/>
               </w:rPr>
-              <w:commentReference w:id="12"/>
+              <w:commentReference w:id="17"/>
             </w:r>
           </w:p>
         </w:tc>
@@ -6377,7 +6556,7 @@
                 <w:lang w:val="en-GB"/>
               </w:rPr>
             </w:pPr>
-            <w:commentRangeStart w:id="13"/>
+            <w:commentRangeStart w:id="18"/>
             <w:r>
               <w:rPr>
                 <w:b/>
@@ -6387,7 +6566,7 @@
               </w:rPr>
               <w:t xml:space="preserve">[ Diagram placeholder </w:t>
             </w:r>
-            <w:commentRangeEnd w:id="13"/>
+            <w:commentRangeEnd w:id="18"/>
             <w:r>
               <w:rPr>
                 <w:rStyle w:val="CommentReference"/>
@@ -6398,7 +6577,7 @@
                 <w:szCs w:val="22"/>
                 <w:lang w:val="en-GB"/>
               </w:rPr>
-              <w:commentReference w:id="13"/>
+              <w:commentReference w:id="18"/>
             </w:r>
             <w:r>
               <w:rPr>
@@ -6670,7 +6849,7 @@
           <w:lang w:val="en-GB"/>
         </w:rPr>
       </w:pPr>
-      <w:commentRangeStart w:id="14"/>
+      <w:commentRangeStart w:id="19"/>
       <w:r>
         <w:rPr>
           <w:b/>
@@ -6679,7 +6858,7 @@
         </w:rPr>
         <w:t>DAO (Data Access Object) Pattern</w:t>
       </w:r>
-      <w:commentRangeEnd w:id="14"/>
+      <w:commentRangeEnd w:id="19"/>
       <w:r>
         <w:rPr>
           <w:rStyle w:val="CommentReference"/>
@@ -6689,7 +6868,7 @@
           <w:szCs w:val="22"/>
           <w:lang w:val="en-GB"/>
         </w:rPr>
-        <w:commentReference w:id="14"/>
+        <w:commentReference w:id="19"/>
       </w:r>
       <w:r>
         <w:rPr>
@@ -6890,7 +7069,7 @@
           <w:lang w:val="en-GB"/>
         </w:rPr>
       </w:pPr>
-      <w:commentRangeStart w:id="15"/>
+      <w:commentRangeStart w:id="20"/>
       <w:r>
         <w:rPr>
           <w:lang w:val="en-GB"/>
@@ -6942,7 +7121,7 @@
         </w:rPr>
         <w:t>. By receiving DAO interfaces rather than concrete implementations, these classes remain loosely coupled to the persistence layer and can be exercised in isolation by injecting mock or alternative implementations during testing</w:t>
       </w:r>
-      <w:commentRangeEnd w:id="15"/>
+      <w:commentRangeEnd w:id="20"/>
       <w:r>
         <w:rPr>
           <w:rStyle w:val="CommentReference"/>
@@ -6950,7 +7129,7 @@
           <w:szCs w:val="22"/>
           <w:lang w:val="en-GB"/>
         </w:rPr>
-        <w:commentReference w:id="15"/>
+        <w:commentReference w:id="20"/>
       </w:r>
       <w:r>
         <w:rPr>
@@ -8120,14 +8299,14 @@
         <w:lastRenderedPageBreak/>
         <w:t xml:space="preserve">5. </w:t>
       </w:r>
-      <w:commentRangeStart w:id="16"/>
+      <w:commentRangeStart w:id="21"/>
       <w:r>
         <w:rPr>
           <w:lang w:val="en-GB"/>
         </w:rPr>
         <w:t>EXCEPTIONS</w:t>
       </w:r>
-      <w:commentRangeEnd w:id="16"/>
+      <w:commentRangeEnd w:id="21"/>
       <w:r>
         <w:rPr>
           <w:rStyle w:val="CommentReference"/>
@@ -8135,7 +8314,7 @@
           <w:szCs w:val="36"/>
           <w:lang w:val="en-GB"/>
         </w:rPr>
-        <w:commentReference w:id="16"/>
+        <w:commentReference w:id="21"/>
       </w:r>
     </w:p>
     <w:p>
@@ -8926,7 +9105,7 @@
           <w:lang w:val="en-GB"/>
         </w:rPr>
       </w:pPr>
-      <w:hyperlink r:id="rId13" w:history="1">
+      <w:hyperlink r:id="rId14" w:history="1">
         <w:r>
           <w:rPr>
             <w:color w:val="0563C1"/>
@@ -8974,7 +9153,7 @@
           <w:lang w:val="en-GB"/>
         </w:rPr>
       </w:pPr>
-      <w:hyperlink r:id="rId14" w:history="1">
+      <w:hyperlink r:id="rId15" w:history="1">
         <w:r>
           <w:rPr>
             <w:color w:val="0563C1"/>
@@ -9055,7 +9234,7 @@
         </w:rPr>
         <w:t xml:space="preserve">Dashboard URL: </w:t>
       </w:r>
-      <w:hyperlink r:id="rId15" w:history="1">
+      <w:hyperlink r:id="rId16" w:history="1">
         <w:r>
           <w:rPr>
             <w:color w:val="0563C1"/>
@@ -9067,8 +9246,8 @@
       </w:hyperlink>
     </w:p>
     <w:sectPr>
-      <w:headerReference w:type="default" r:id="rId16"/>
-      <w:footerReference w:type="default" r:id="rId17"/>
+      <w:headerReference w:type="default" r:id="rId17"/>
+      <w:footerReference w:type="default" r:id="rId18"/>
       <w:pgSz w:w="11906" w:h="16838"/>
       <w:pgMar w:top="1440" w:right="1440" w:bottom="1440" w:left="1440" w:header="708" w:footer="708" w:gutter="0"/>
       <w:cols w:space="720"/>
@@ -9112,7 +9291,7 @@
       </w:r>
     </w:p>
   </w:comment>
-  <w:comment w:id="1" w:author="davide brugnoli" w:date="2026-04-30T11:50:00Z" w:initials="db">
+  <w:comment w:id="1" w:author="davide brugnoli" w:date="2026-06-01T17:55:00Z" w:initials="db">
     <w:p>
       <w:pPr>
         <w:pStyle w:val="CommentText"/>
@@ -9124,11 +9303,59 @@
         <w:annotationRef/>
       </w:r>
       <w:r>
+        <w:t>-questione observere per controllare la presenza di notifiche</w:t>
+      </w:r>
+    </w:p>
+  </w:comment>
+  <w:comment w:id="2" w:author="davide brugnoli" w:date="2026-06-01T17:57:00Z" w:initials="db">
+    <w:p>
+      <w:pPr>
+        <w:pStyle w:val="CommentText"/>
+      </w:pPr>
+      <w:r>
+        <w:rPr>
+          <w:rStyle w:val="CommentReference"/>
+        </w:rPr>
+        <w:annotationRef/>
+      </w:r>
+      <w:r>
+        <w:t>-questione controlli nello strato di persistenza</w:t>
+      </w:r>
+    </w:p>
+  </w:comment>
+  <w:comment w:id="3" w:author="davide brugnoli" w:date="2026-06-01T18:02:00Z" w:initials="db">
+    <w:p>
+      <w:pPr>
+        <w:pStyle w:val="CommentText"/>
+      </w:pPr>
+      <w:r>
+        <w:rPr>
+          <w:rStyle w:val="CommentReference"/>
+        </w:rPr>
+        <w:annotationRef/>
+      </w:r>
+      <w:r>
+        <w:t>Esegui check su consigli</w:t>
+      </w:r>
+    </w:p>
+  </w:comment>
+  <w:comment w:id="4" w:author="davide brugnoli" w:date="2026-04-30T11:50:00Z" w:initials="db">
+    <w:p>
+      <w:pPr>
+        <w:pStyle w:val="CommentText"/>
+      </w:pPr>
+      <w:r>
+        <w:rPr>
+          <w:rStyle w:val="CommentReference"/>
+        </w:rPr>
+        <w:annotationRef/>
+      </w:r>
+      <w:r>
         <w:t>I requisiti sono specifici per lo sviluppo, controllare se va bene e in caso adattarli all’utilizzo e non allo sviluppo</w:t>
       </w:r>
     </w:p>
   </w:comment>
-  <w:comment w:id="2" w:author="davide brugnoli" w:date="2026-04-30T11:50:00Z" w:initials="db">
+  <w:comment w:id="5" w:author="davide brugnoli" w:date="2026-04-30T11:50:00Z" w:initials="db">
     <w:p>
       <w:pPr>
         <w:pStyle w:val="CommentText"/>
@@ -9144,7 +9371,7 @@
       </w:r>
     </w:p>
   </w:comment>
-  <w:comment w:id="3" w:author="davide brugnoli" w:date="2026-05-26T15:25:00Z" w:initials="db">
+  <w:comment w:id="6" w:author="davide brugnoli" w:date="2026-05-26T15:25:00Z" w:initials="db">
     <w:p>
       <w:pPr>
         <w:pStyle w:val="CommentText"/>
@@ -9160,7 +9387,7 @@
       </w:r>
     </w:p>
   </w:comment>
-  <w:comment w:id="4" w:author="davide brugnoli" w:date="2026-05-26T15:28:00Z" w:initials="db">
+  <w:comment w:id="7" w:author="davide brugnoli" w:date="2026-05-26T15:28:00Z" w:initials="db">
     <w:p>
       <w:pPr>
         <w:pStyle w:val="CommentText"/>
@@ -9176,7 +9403,7 @@
       </w:r>
     </w:p>
   </w:comment>
-  <w:comment w:id="5" w:author="davide brugnoli" w:date="2026-04-30T11:58:00Z" w:initials="db">
+  <w:comment w:id="8" w:author="davide brugnoli" w:date="2026-06-01T17:52:00Z" w:initials="db">
     <w:p>
       <w:pPr>
         <w:pStyle w:val="CommentText"/>
@@ -9188,11 +9415,27 @@
         <w:annotationRef/>
       </w:r>
       <w:r>
+        <w:t>Rimuovere shall allow (nei consiglie è indicato come errore)</w:t>
+      </w:r>
+    </w:p>
+  </w:comment>
+  <w:comment w:id="9" w:author="davide brugnoli" w:date="2026-04-30T11:58:00Z" w:initials="db">
+    <w:p>
+      <w:pPr>
+        <w:pStyle w:val="CommentText"/>
+      </w:pPr>
+      <w:r>
+        <w:rPr>
+          <w:rStyle w:val="CommentReference"/>
+        </w:rPr>
+        <w:annotationRef/>
+      </w:r>
+      <w:r>
         <w:t>Ricontrolla</w:t>
       </w:r>
     </w:p>
   </w:comment>
-  <w:comment w:id="6" w:author="davide brugnoli" w:date="2026-05-26T15:29:00Z" w:initials="db">
+  <w:comment w:id="10" w:author="davide brugnoli" w:date="2026-05-26T15:29:00Z" w:initials="db">
     <w:p>
       <w:pPr>
         <w:pStyle w:val="CommentText"/>
@@ -9208,7 +9451,7 @@
       </w:r>
     </w:p>
   </w:comment>
-  <w:comment w:id="7" w:author="davide brugnoli" w:date="2026-05-26T15:30:00Z" w:initials="db">
+  <w:comment w:id="11" w:author="davide brugnoli" w:date="2026-05-26T15:30:00Z" w:initials="db">
     <w:p>
       <w:pPr>
         <w:pStyle w:val="CommentText"/>
@@ -9224,7 +9467,7 @@
       </w:r>
     </w:p>
   </w:comment>
-  <w:comment w:id="8" w:author="davide brugnoli" w:date="2026-05-26T15:32:00Z" w:initials="db">
+  <w:comment w:id="12" w:author="davide brugnoli" w:date="2026-05-26T15:32:00Z" w:initials="db">
     <w:p>
       <w:pPr>
         <w:pStyle w:val="CommentText"/>
@@ -9240,7 +9483,7 @@
       </w:r>
     </w:p>
   </w:comment>
-  <w:comment w:id="9" w:author="davide brugnoli" w:date="2026-04-30T12:11:00Z" w:initials="db">
+  <w:comment w:id="13" w:author="davide brugnoli" w:date="2026-04-30T12:11:00Z" w:initials="db">
     <w:p>
       <w:pPr>
         <w:pStyle w:val="CommentText"/>
@@ -9256,7 +9499,7 @@
       </w:r>
     </w:p>
   </w:comment>
-  <w:comment w:id="10" w:author="davide brugnoli" w:date="2026-04-30T12:11:00Z" w:initials="db">
+  <w:comment w:id="14" w:author="davide brugnoli" w:date="2026-04-30T12:11:00Z" w:initials="db">
     <w:p>
       <w:pPr>
         <w:pStyle w:val="CommentText"/>
@@ -9272,7 +9515,7 @@
       </w:r>
     </w:p>
   </w:comment>
-  <w:comment w:id="11" w:author="davide brugnoli" w:date="2026-04-30T12:15:00Z" w:initials="db">
+  <w:comment w:id="15" w:author="davide brugnoli" w:date="2026-04-30T12:15:00Z" w:initials="db">
     <w:p>
       <w:pPr>
         <w:pStyle w:val="CommentText"/>
@@ -9288,7 +9531,7 @@
       </w:r>
     </w:p>
   </w:comment>
-  <w:comment w:id="12" w:author="davide brugnoli" w:date="2026-05-26T15:44:00Z" w:initials="db">
+  <w:comment w:id="16" w:author="davide brugnoli" w:date="2026-06-03T11:04:00Z" w:initials="db">
     <w:p>
       <w:pPr>
         <w:pStyle w:val="CommentText"/>
@@ -9300,11 +9543,27 @@
         <w:annotationRef/>
       </w:r>
       <w:r>
+        <w:t>Da rimuovere</w:t>
+      </w:r>
+    </w:p>
+  </w:comment>
+  <w:comment w:id="17" w:author="davide brugnoli" w:date="2026-05-26T15:44:00Z" w:initials="db">
+    <w:p>
+      <w:pPr>
+        <w:pStyle w:val="CommentText"/>
+      </w:pPr>
+      <w:r>
+        <w:rPr>
+          <w:rStyle w:val="CommentReference"/>
+        </w:rPr>
+        <w:annotationRef/>
+      </w:r>
+      <w:r>
         <w:t>Controlla se altri progetti usano com.example.rm.app</w:t>
       </w:r>
     </w:p>
   </w:comment>
-  <w:comment w:id="13" w:author="davide brugnoli" w:date="2026-05-26T15:45:00Z" w:initials="db">
+  <w:comment w:id="18" w:author="davide brugnoli" w:date="2026-05-26T15:45:00Z" w:initials="db">
     <w:p>
       <w:pPr>
         <w:pStyle w:val="CommentText"/>
@@ -9320,7 +9579,7 @@
       </w:r>
     </w:p>
   </w:comment>
-  <w:comment w:id="14" w:author="davide brugnoli" w:date="2026-05-26T15:46:00Z" w:initials="db">
+  <w:comment w:id="19" w:author="davide brugnoli" w:date="2026-05-26T15:46:00Z" w:initials="db">
     <w:p>
       <w:pPr>
         <w:pStyle w:val="CommentText"/>
@@ -9336,7 +9595,7 @@
       </w:r>
     </w:p>
   </w:comment>
-  <w:comment w:id="15" w:author="davide brugnoli" w:date="2026-05-26T15:48:00Z" w:initials="db">
+  <w:comment w:id="20" w:author="davide brugnoli" w:date="2026-05-26T15:48:00Z" w:initials="db">
     <w:p>
       <w:pPr>
         <w:pStyle w:val="CommentText"/>
@@ -9352,7 +9611,7 @@
       </w:r>
     </w:p>
   </w:comment>
-  <w:comment w:id="16" w:author="davide brugnoli" w:date="2026-05-26T15:53:00Z" w:initials="db">
+  <w:comment w:id="21" w:author="davide brugnoli" w:date="2026-05-26T15:53:00Z" w:initials="db">
     <w:p>
       <w:pPr>
         <w:pStyle w:val="CommentText"/>
@@ -9374,17 +9633,22 @@
 <file path=word/commentsExtended.xml><?xml version="1.0" encoding="utf-8"?>
 <w15:commentsEx xmlns:wpc="http://schemas.microsoft.com/office/word/2010/wordprocessingCanvas" xmlns:cx="http://schemas.microsoft.com/office/drawing/2014/chartex" xmlns:cx1="http://schemas.microsoft.com/office/drawing/2015/9/8/chartex" xmlns:cx2="http://schemas.microsoft.com/office/drawing/2015/10/21/chartex" xmlns:cx3="http://schemas.microsoft.com/office/drawing/2016/5/9/chartex" xmlns:cx4="http://schemas.microsoft.com/office/drawing/2016/5/10/chartex" xmlns:cx5="http://schemas.microsoft.com/office/drawing/2016/5/11/chartex" xmlns:cx6="http://schemas.microsoft.com/office/drawing/2016/5/12/chartex" xmlns:cx7="http://schemas.microsoft.com/office/drawing/2016/5/13/chartex" xmlns:cx8="http://schemas.microsoft.com/office/drawing/2016/5/14/chartex" xmlns:mc="http://schemas.openxmlformats.org/markup-compatibility/2006" xmlns:aink="http://schemas.microsoft.com/office/drawing/2016/ink" xmlns:am3d="http://schemas.microsoft.com/office/drawing/2017/model3d" xmlns:o="urn:schemas-microsoft-com:office:office" xmlns:oel="http://schemas.microsoft.com/office/2019/extlst" xmlns:r="http://schemas.openxmlformats.org/officeDocument/2006/relationships" xmlns:m="http://schemas.openxmlformats.org/officeDocument/2006/math" xmlns:v="urn:schemas-microsoft-com:vml" xmlns:wp14="http://schemas.microsoft.com/office/word/2010/wordprocessingDrawing" xmlns:wp="http://schemas.openxmlformats.org/drawingml/2006/wordprocessingDrawing" xmlns:w10="urn:schemas-microsoft-com:office:word" xmlns:w="http://schemas.openxmlformats.org/wordprocessingml/2006/main" xmlns:w14="http://schemas.microsoft.com/office/word/2010/wordml" xmlns:w15="http://schemas.microsoft.com/office/word/2012/wordml" xmlns:w16cex="http://schemas.microsoft.com/office/word/2018/wordml/cex" xmlns:w16cid="http://schemas.microsoft.com/office/word/2016/wordml/cid" xmlns:w16="http://schemas.microsoft.com/office/word/2018/wordml" xmlns:w16du="http://schemas.microsoft.com/office/word/2023/wordml/word16du" xmlns:w16sdtdh="http://schemas.microsoft.com/office/word/2020/wordml/sdtdatahash" xmlns:w16sdtfl="http://schemas.microsoft.com/office/word/2024/wordml/sdtformatlock" xmlns:w16se="http://schemas.microsoft.com/office/word/2015/wordml/symex" xmlns:wpg="http://schemas.microsoft.com/office/word/2010/wordprocessingGroup" xmlns:wpi="http://schemas.microsoft.com/office/word/2010/wordprocessingInk" xmlns:wne="http://schemas.microsoft.com/office/word/2006/wordml" xmlns:wps="http://schemas.microsoft.com/office/word/2010/wordprocessingShape" mc:Ignorable="w14 w15 w16se w16cid w16 w16cex w16sdtdh w16sdtfl w16du wp14">
   <w15:commentEx w15:paraId="5DABDE37" w15:done="0"/>
+  <w15:commentEx w15:paraId="5D36B10B" w15:paraIdParent="5DABDE37" w15:done="0"/>
+  <w15:commentEx w15:paraId="15B5B6FE" w15:paraIdParent="5DABDE37" w15:done="0"/>
+  <w15:commentEx w15:paraId="55E1E209" w15:paraIdParent="5DABDE37" w15:done="0"/>
   <w15:commentEx w15:paraId="63C32BE6" w15:done="0"/>
   <w15:commentEx w15:paraId="5ABC12F1" w15:done="0"/>
   <w15:commentEx w15:paraId="06108AB1" w15:done="0"/>
   <w15:commentEx w15:paraId="6948B227" w15:done="0"/>
+  <w15:commentEx w15:paraId="2ECF85D9" w15:done="0"/>
   <w15:commentEx w15:paraId="23F9DCC9" w15:done="0"/>
   <w15:commentEx w15:paraId="36AB0C9D" w15:done="0"/>
   <w15:commentEx w15:paraId="5A4F53AA" w15:done="0"/>
   <w15:commentEx w15:paraId="38391F09" w15:paraIdParent="5A4F53AA" w15:done="0"/>
   <w15:commentEx w15:paraId="43FA236F" w15:done="0"/>
   <w15:commentEx w15:paraId="62075B69" w15:done="0"/>
-  <w15:commentEx w15:paraId="5891CD9E" w15:done="0"/>
+  <w15:commentEx w15:paraId="0BD793F5" w15:done="0"/>
+  <w15:commentEx w15:paraId="56CDDAF6" w15:done="0"/>
   <w15:commentEx w15:paraId="47FB3CB4" w15:done="0"/>
   <w15:commentEx w15:paraId="7D039CDD" w15:done="0"/>
   <w15:commentEx w15:paraId="61D113FC" w15:done="0"/>
@@ -9408,10 +9672,14 @@
       </w16:ext>
     </w16cex:extLst>
   </w16cex:commentExtensible>
+  <w16cex:commentExtensible w16cex:durableId="59D23E0B" w16cex:dateUtc="2026-06-01T15:55:00Z"/>
+  <w16cex:commentExtensible w16cex:durableId="403C0F0D" w16cex:dateUtc="2026-06-01T15:57:00Z"/>
+  <w16cex:commentExtensible w16cex:durableId="4DF94135" w16cex:dateUtc="2026-06-01T16:02:00Z"/>
   <w16cex:commentExtensible w16cex:durableId="5AB1A90F" w16cex:dateUtc="2026-04-30T09:50:00Z"/>
   <w16cex:commentExtensible w16cex:durableId="223CE331" w16cex:dateUtc="2026-04-30T09:50:00Z"/>
   <w16cex:commentExtensible w16cex:durableId="66A7F010" w16cex:dateUtc="2026-05-26T13:25:00Z"/>
   <w16cex:commentExtensible w16cex:durableId="643AFE80" w16cex:dateUtc="2026-05-26T13:28:00Z"/>
+  <w16cex:commentExtensible w16cex:durableId="1602E17F" w16cex:dateUtc="2026-06-01T15:52:00Z"/>
   <w16cex:commentExtensible w16cex:durableId="6D76DFA0" w16cex:dateUtc="2026-04-30T09:58:00Z"/>
   <w16cex:commentExtensible w16cex:durableId="4CCF2757" w16cex:dateUtc="2026-05-26T13:29:00Z"/>
   <w16cex:commentExtensible w16cex:durableId="3DC8BF16" w16cex:dateUtc="2026-05-26T13:30:00Z">
@@ -9431,6 +9699,7 @@
   <w16cex:commentExtensible w16cex:durableId="2282B6D7" w16cex:dateUtc="2026-04-30T10:11:00Z"/>
   <w16cex:commentExtensible w16cex:durableId="2EFD151C" w16cex:dateUtc="2026-04-30T10:11:00Z"/>
   <w16cex:commentExtensible w16cex:durableId="33EF2EA6" w16cex:dateUtc="2026-04-30T10:15:00Z"/>
+  <w16cex:commentExtensible w16cex:durableId="29BDC699" w16cex:dateUtc="2026-06-03T09:04:00Z"/>
   <w16cex:commentExtensible w16cex:durableId="6FA98D39" w16cex:dateUtc="2026-05-26T13:44:00Z"/>
   <w16cex:commentExtensible w16cex:durableId="1DBF2124" w16cex:dateUtc="2026-05-26T13:45:00Z"/>
   <w16cex:commentExtensible w16cex:durableId="1B4900E6" w16cex:dateUtc="2026-05-26T13:46:00Z"/>
@@ -9442,17 +9711,22 @@
 <file path=word/commentsIds.xml><?xml version="1.0" encoding="utf-8"?>
 <w16cid:commentsIds xmlns:wpc="http://schemas.microsoft.com/office/word/2010/wordprocessingCanvas" xmlns:cx="http://schemas.microsoft.com/office/drawing/2014/chartex" xmlns:cx1="http://schemas.microsoft.com/office/drawing/2015/9/8/chartex" xmlns:cx2="http://schemas.microsoft.com/office/drawing/2015/10/21/chartex" xmlns:cx3="http://schemas.microsoft.com/office/drawing/2016/5/9/chartex" xmlns:cx4="http://schemas.microsoft.com/office/drawing/2016/5/10/chartex" xmlns:cx5="http://schemas.microsoft.com/office/drawing/2016/5/11/chartex" xmlns:cx6="http://schemas.microsoft.com/office/drawing/2016/5/12/chartex" xmlns:cx7="http://schemas.microsoft.com/office/drawing/2016/5/13/chartex" xmlns:cx8="http://schemas.microsoft.com/office/drawing/2016/5/14/chartex" xmlns:mc="http://schemas.openxmlformats.org/markup-compatibility/2006" xmlns:aink="http://schemas.microsoft.com/office/drawing/2016/ink" xmlns:am3d="http://schemas.microsoft.com/office/drawing/2017/model3d" xmlns:o="urn:schemas-microsoft-com:office:office" xmlns:oel="http://schemas.microsoft.com/office/2019/extlst" xmlns:r="http://schemas.openxmlformats.org/officeDocument/2006/relationships" xmlns:m="http://schemas.openxmlformats.org/officeDocument/2006/math" xmlns:v="urn:schemas-microsoft-com:vml" xmlns:wp14="http://schemas.microsoft.com/office/word/2010/wordprocessingDrawing" xmlns:wp="http://schemas.openxmlformats.org/drawingml/2006/wordprocessingDrawing" xmlns:w10="urn:schemas-microsoft-com:office:word" xmlns:w="http://schemas.openxmlformats.org/wordprocessingml/2006/main" xmlns:w14="http://schemas.microsoft.com/office/word/2010/wordml" xmlns:w15="http://schemas.microsoft.com/office/word/2012/wordml" xmlns:w16cex="http://schemas.microsoft.com/office/word/2018/wordml/cex" xmlns:w16cid="http://schemas.microsoft.com/office/word/2016/wordml/cid" xmlns:w16="http://schemas.microsoft.com/office/word/2018/wordml" xmlns:w16du="http://schemas.microsoft.com/office/word/2023/wordml/word16du" xmlns:w16sdtdh="http://schemas.microsoft.com/office/word/2020/wordml/sdtdatahash" xmlns:w16sdtfl="http://schemas.microsoft.com/office/word/2024/wordml/sdtformatlock" xmlns:w16se="http://schemas.microsoft.com/office/word/2015/wordml/symex" xmlns:wpg="http://schemas.microsoft.com/office/word/2010/wordprocessingGroup" xmlns:wpi="http://schemas.microsoft.com/office/word/2010/wordprocessingInk" xmlns:wne="http://schemas.microsoft.com/office/word/2006/wordml" xmlns:wps="http://schemas.microsoft.com/office/word/2010/wordprocessingShape" mc:Ignorable="w14 w15 w16se w16cid w16 w16cex w16sdtdh w16sdtfl w16du wp14">
   <w16cid:commentId w16cid:paraId="5DABDE37" w16cid:durableId="26653817"/>
+  <w16cid:commentId w16cid:paraId="5D36B10B" w16cid:durableId="59D23E0B"/>
+  <w16cid:commentId w16cid:paraId="15B5B6FE" w16cid:durableId="403C0F0D"/>
+  <w16cid:commentId w16cid:paraId="55E1E209" w16cid:durableId="4DF94135"/>
   <w16cid:commentId w16cid:paraId="63C32BE6" w16cid:durableId="5AB1A90F"/>
   <w16cid:commentId w16cid:paraId="5ABC12F1" w16cid:durableId="223CE331"/>
   <w16cid:commentId w16cid:paraId="06108AB1" w16cid:durableId="66A7F010"/>
   <w16cid:commentId w16cid:paraId="6948B227" w16cid:durableId="643AFE80"/>
+  <w16cid:commentId w16cid:paraId="2ECF85D9" w16cid:durableId="1602E17F"/>
   <w16cid:commentId w16cid:paraId="23F9DCC9" w16cid:durableId="6D76DFA0"/>
   <w16cid:commentId w16cid:paraId="36AB0C9D" w16cid:durableId="4CCF2757"/>
   <w16cid:commentId w16cid:paraId="5A4F53AA" w16cid:durableId="3DC8BF16"/>
   <w16cid:commentId w16cid:paraId="38391F09" w16cid:durableId="52A6E0D1"/>
   <w16cid:commentId w16cid:paraId="43FA236F" w16cid:durableId="2282B6D7"/>
   <w16cid:commentId w16cid:paraId="62075B69" w16cid:durableId="2EFD151C"/>
-  <w16cid:commentId w16cid:paraId="5891CD9E" w16cid:durableId="33EF2EA6"/>
+  <w16cid:commentId w16cid:paraId="0BD793F5" w16cid:durableId="33EF2EA6"/>
+  <w16cid:commentId w16cid:paraId="56CDDAF6" w16cid:durableId="29BDC699"/>
   <w16cid:commentId w16cid:paraId="47FB3CB4" w16cid:durableId="6FA98D39"/>
   <w16cid:commentId w16cid:paraId="7D039CDD" w16cid:durableId="1DBF2124"/>
   <w16cid:commentId w16cid:paraId="61D113FC" w16cid:durableId="1B4900E6"/>

</xml_diff>

<commit_message>
add external API for allergens
</commit_message>
<xml_diff>
--- a/NEWDOCUMENTATION.docx
+++ b/NEWDOCUMENTATION.docx
@@ -3614,7 +3614,7 @@
         <w:rPr>
           <w:lang w:val="en-GB"/>
         </w:rPr>
-        <w:t>The system shall allow authorized users to retrieve active and historical orders associated with a specific table, with optional filtering by status and time range.</w:t>
+        <w:t>The system shall retrieve active and historical orders associated with a specified table for authorized users.</w:t>
       </w:r>
     </w:p>
     <w:p>
@@ -3641,7 +3641,7 @@
         <w:rPr>
           <w:lang w:val="en-GB"/>
         </w:rPr>
-        <w:t>The system shall compute and display the total bill for a table based on the prices of the associated order items at the time of ordering.</w:t>
+        <w:t>The system shall filter retrieved orders by status and time range.</w:t>
       </w:r>
     </w:p>
     <w:p>
@@ -3668,19 +3668,7 @@
         <w:rPr>
           <w:lang w:val="en-GB"/>
         </w:rPr>
-        <w:t>The system shall allow authorized users to add free-text notes to individual orde</w:t>
-      </w:r>
-      <w:r>
-        <w:rPr>
-          <w:lang w:val="en-GB"/>
-        </w:rPr>
-        <w:t>r</w:t>
-      </w:r>
-      <w:r>
-        <w:rPr>
-          <w:lang w:val="en-GB"/>
-        </w:rPr>
-        <w:t>.</w:t>
+        <w:t>The system shall associate free-text notes with individual orders upon request by an authorized user.</w:t>
       </w:r>
     </w:p>
     <w:p>
@@ -3707,7 +3695,7 @@
         <w:rPr>
           <w:lang w:val="en-GB"/>
         </w:rPr>
-        <w:t>The system shall allow authorized users to delete an order or order item before billing confirmation.</w:t>
+        <w:t>The system shall remove orders or order items before billing confirmation when the operation is requested by an authorized user.</w:t>
       </w:r>
     </w:p>
     <w:p>
@@ -3731,6 +3719,7 @@
         <w:t>FR-7</w:t>
       </w:r>
       <w:commentRangeStart w:id="10"/>
+      <w:commentRangeStart w:id="11"/>
       <w:r>
         <w:rPr>
           <w:b/>
@@ -3754,6 +3743,16 @@
           <w:lang w:val="en-GB"/>
         </w:rPr>
         <w:commentReference w:id="10"/>
+      </w:r>
+      <w:commentRangeEnd w:id="11"/>
+      <w:r>
+        <w:rPr>
+          <w:rStyle w:val="CommentReference"/>
+          <w:sz w:val="22"/>
+          <w:szCs w:val="22"/>
+          <w:lang w:val="en-GB"/>
+        </w:rPr>
+        <w:commentReference w:id="11"/>
       </w:r>
       <w:r>
         <w:rPr>
@@ -3801,17 +3800,15 @@
       <w:pPr>
         <w:pStyle w:val="Heading3"/>
       </w:pPr>
-      <w:commentRangeStart w:id="11"/>
-      <w:commentRangeStart w:id="12"/>
       <w:r>
         <w:rPr>
           <w:noProof/>
         </w:rPr>
         <w:drawing>
-          <wp:inline distT="0" distB="0" distL="0" distR="0" wp14:anchorId="5F14EC7D" wp14:editId="08C12B3E">
-            <wp:extent cx="4023222" cy="7434943"/>
-            <wp:effectExtent l="0" t="0" r="0" b="0"/>
-            <wp:docPr id="609894315" name="Picture 1" descr="https://www.draw.io/?open=G1txPeGvxcTNT7-BY-CzpXVmIukKzBXq2L&amp;local-data=%7B%22type%22%3A%22Drive%22%2C%22id%22%3A%221txPeGvxcTNT7-BY-CzpXVmIukKzBXq2L%22%2C%22lastModifiedDate%22%3A%222026-04-30T10%3A00%3A18.761Z%22%2C%22pageId%22%3A%22mSYs8jFOtbkVvdMbbuip%22%2C%22layers%22%3A%5B0%5D%7D"/>
+          <wp:inline distT="0" distB="0" distL="0" distR="0" wp14:anchorId="2A72E3FE" wp14:editId="4634D51A">
+            <wp:extent cx="4723789" cy="7668603"/>
+            <wp:effectExtent l="0" t="0" r="635" b="8890"/>
+            <wp:docPr id="515028642" name="Picture 1" descr="https://www.draw.io/?open=G1txPeGvxcTNT7-BY-CzpXVmIukKzBXq2L&amp;local-data=%7B%22type%22%3A%22Drive%22%2C%22id%22%3A%221txPeGvxcTNT7-BY-CzpXVmIukKzBXq2L%22%2C%22lastModifiedDate%22%3A%222026-06-03T14%3A06%3A18.057Z%22%2C%22pageId%22%3A%22mSYs8jFOtbkVvdMbbuip%22%2C%22layers%22%3A%5B0%5D%7D"/>
             <wp:cNvGraphicFramePr>
               <a:graphicFrameLocks xmlns:a="http://schemas.openxmlformats.org/drawingml/2006/main" noChangeAspect="1"/>
             </wp:cNvGraphicFramePr>
@@ -3819,7 +3816,7 @@
               <a:graphicData uri="http://schemas.openxmlformats.org/drawingml/2006/picture">
                 <pic:pic xmlns:pic="http://schemas.openxmlformats.org/drawingml/2006/picture">
                   <pic:nvPicPr>
-                    <pic:cNvPr id="609894315" name="Picture 1" descr="https://www.draw.io/?open=G1txPeGvxcTNT7-BY-CzpXVmIukKzBXq2L&amp;local-data=%7B%22type%22%3A%22Drive%22%2C%22id%22%3A%221txPeGvxcTNT7-BY-CzpXVmIukKzBXq2L%22%2C%22lastModifiedDate%22%3A%222026-04-30T10%3A00%3A18.761Z%22%2C%22pageId%22%3A%22mSYs8jFOtbkVvdMbbuip%22%2C%22layers%22%3A%5B0%5D%7D"/>
+                    <pic:cNvPr id="515028642" name="Picture 1" descr="https://www.draw.io/?open=G1txPeGvxcTNT7-BY-CzpXVmIukKzBXq2L&amp;local-data=%7B%22type%22%3A%22Drive%22%2C%22id%22%3A%221txPeGvxcTNT7-BY-CzpXVmIukKzBXq2L%22%2C%22lastModifiedDate%22%3A%222026-06-03T14%3A06%3A18.057Z%22%2C%22pageId%22%3A%22mSYs8jFOtbkVvdMbbuip%22%2C%22layers%22%3A%5B0%5D%7D"/>
                     <pic:cNvPicPr/>
                   </pic:nvPicPr>
                   <pic:blipFill>
@@ -3837,7 +3834,7 @@
                   <pic:spPr>
                     <a:xfrm>
                       <a:off x="0" y="0"/>
-                      <a:ext cx="4031447" cy="7450143"/>
+                      <a:ext cx="4731829" cy="7681655"/>
                     </a:xfrm>
                     <a:prstGeom prst="rect">
                       <a:avLst/>
@@ -3849,48 +3846,26 @@
           </wp:inline>
         </w:drawing>
       </w:r>
-      <w:commentRangeEnd w:id="11"/>
-      <w:r>
-        <w:rPr>
-          <w:rStyle w:val="CommentReference"/>
+    </w:p>
+    <w:p>
+      <w:pPr>
+        <w:rPr>
+          <w:lang w:val="en-GB"/>
+        </w:rPr>
+      </w:pPr>
+      <w:r>
+        <w:rPr>
+          <w:lang w:val="en-GB"/>
+        </w:rPr>
+        <w:br w:type="page"/>
+      </w:r>
+      <w:r>
+        <w:rPr>
+          <w:b/>
+          <w:bCs/>
+          <w:color w:val="C0392B"/>
           <w:sz w:val="24"/>
           <w:szCs w:val="24"/>
-        </w:rPr>
-        <w:commentReference w:id="11"/>
-      </w:r>
-      <w:commentRangeEnd w:id="12"/>
-      <w:r>
-        <w:rPr>
-          <w:rStyle w:val="CommentReference"/>
-          <w:sz w:val="24"/>
-          <w:szCs w:val="24"/>
-        </w:rPr>
-        <w:commentReference w:id="12"/>
-      </w:r>
-    </w:p>
-    <w:p>
-      <w:pPr>
-        <w:rPr>
-          <w:lang w:val="en-GB"/>
-        </w:rPr>
-      </w:pPr>
-      <w:r>
-        <w:rPr>
-          <w:lang w:val="en-GB"/>
-        </w:rPr>
-        <w:br w:type="page"/>
-      </w:r>
-    </w:p>
-    <w:p>
-      <w:pPr>
-        <w:pStyle w:val="Heading3"/>
-        <w:rPr>
-          <w:lang w:val="en-GB"/>
-        </w:rPr>
-      </w:pPr>
-      <w:r>
-        <w:rPr>
-          <w:lang w:val="en-GB"/>
         </w:rPr>
         <w:lastRenderedPageBreak/>
         <w:t>1.4.2 INTERNAL STEPS</w:t>
@@ -4694,22 +4669,35 @@
           <w:lang w:val="en-GB"/>
         </w:rPr>
       </w:pPr>
-      <w:commentRangeStart w:id="13"/>
-      <w:r>
-        <w:rPr>
-          <w:lang w:val="en-GB"/>
-        </w:rPr>
-        <w:t>The manager optionally applies filters (time range, status).</w:t>
-      </w:r>
-      <w:commentRangeEnd w:id="13"/>
-      <w:r>
-        <w:rPr>
-          <w:rStyle w:val="CommentReference"/>
-          <w:sz w:val="22"/>
-          <w:szCs w:val="22"/>
-          <w:lang w:val="en-GB"/>
-        </w:rPr>
-        <w:commentReference w:id="13"/>
+      <w:r>
+        <w:rPr>
+          <w:lang w:val="en-GB"/>
+        </w:rPr>
+        <w:t>The system updates the displayed data accordingly</w:t>
+      </w:r>
+      <w:r>
+        <w:rPr>
+          <w:lang w:val="en-GB"/>
+        </w:rPr>
+        <w:t>.</w:t>
+      </w:r>
+    </w:p>
+    <w:p>
+      <w:pPr>
+        <w:spacing w:after="120" w:line="300" w:lineRule="auto"/>
+        <w:ind w:left="270"/>
+        <w:jc w:val="both"/>
+        <w:rPr>
+          <w:i/>
+          <w:iCs/>
+        </w:rPr>
+      </w:pPr>
+      <w:r>
+        <w:rPr>
+          <w:i/>
+          <w:iCs/>
+        </w:rPr>
+        <w:t>Extensions:</w:t>
       </w:r>
     </w:p>
     <w:p>
@@ -4717,7 +4705,7 @@
         <w:pStyle w:val="ListParagraph"/>
         <w:numPr>
           <w:ilvl w:val="0"/>
-          <w:numId w:val="7"/>
+          <w:numId w:val="11"/>
         </w:numPr>
         <w:spacing w:after="80" w:line="280" w:lineRule="auto"/>
         <w:rPr>
@@ -4726,9 +4714,25 @@
       </w:pPr>
       <w:r>
         <w:rPr>
-          <w:lang w:val="en-GB"/>
-        </w:rPr>
-        <w:t>The system updates the displayed data accordingly.</w:t>
+          <w:b/>
+          <w:bCs/>
+          <w:lang w:val="en-GB"/>
+        </w:rPr>
+        <w:t>2a</w:t>
+      </w:r>
+      <w:r>
+        <w:rPr>
+          <w:i/>
+          <w:iCs/>
+          <w:lang w:val="en-GB"/>
+        </w:rPr>
+        <w:t xml:space="preserve">: </w:t>
+      </w:r>
+      <w:r>
+        <w:rPr>
+          <w:lang w:val="en-GB"/>
+        </w:rPr>
+        <w:t>The manager optionally applies filters (time range, status).</w:t>
       </w:r>
     </w:p>
     <w:p>
@@ -4823,22 +4827,11 @@
           <w:lang w:val="en-GB"/>
         </w:rPr>
       </w:pPr>
-      <w:commentRangeStart w:id="14"/>
-      <w:r>
-        <w:rPr>
-          <w:lang w:val="en-GB"/>
-        </w:rPr>
-        <w:t>The cashier optionally applies a discount.</w:t>
-      </w:r>
-      <w:commentRangeEnd w:id="14"/>
-      <w:r>
-        <w:rPr>
-          <w:rStyle w:val="CommentReference"/>
-          <w:sz w:val="22"/>
-          <w:szCs w:val="22"/>
-          <w:lang w:val="en-GB"/>
-        </w:rPr>
-        <w:commentReference w:id="14"/>
+      <w:r>
+        <w:rPr>
+          <w:lang w:val="en-GB"/>
+        </w:rPr>
+        <w:t>The cashier confirms the closure of the order.</w:t>
       </w:r>
     </w:p>
     <w:p>
@@ -4857,7 +4850,25 @@
         <w:rPr>
           <w:lang w:val="en-GB"/>
         </w:rPr>
-        <w:t>The cashier confirms the closure of the order.</w:t>
+        <w:t>The system marks the order as closed and removes it from the active dashboards of the other roles.</w:t>
+      </w:r>
+    </w:p>
+    <w:p>
+      <w:pPr>
+        <w:spacing w:after="120" w:line="300" w:lineRule="auto"/>
+        <w:ind w:firstLine="270"/>
+        <w:jc w:val="both"/>
+        <w:rPr>
+          <w:i/>
+          <w:iCs/>
+        </w:rPr>
+      </w:pPr>
+      <w:r>
+        <w:rPr>
+          <w:i/>
+          <w:iCs/>
+        </w:rPr>
+        <w:t>Extensions:</w:t>
       </w:r>
     </w:p>
     <w:p>
@@ -4865,7 +4876,7 @@
         <w:pStyle w:val="ListParagraph"/>
         <w:numPr>
           <w:ilvl w:val="0"/>
-          <w:numId w:val="8"/>
+          <w:numId w:val="11"/>
         </w:numPr>
         <w:spacing w:after="80" w:line="280" w:lineRule="auto"/>
         <w:rPr>
@@ -4874,9 +4885,34 @@
       </w:pPr>
       <w:r>
         <w:rPr>
-          <w:lang w:val="en-GB"/>
-        </w:rPr>
-        <w:t>The system marks the order as closed and removes it from the active dashboards of the other roles.</w:t>
+          <w:b/>
+          <w:bCs/>
+          <w:lang w:val="en-GB"/>
+        </w:rPr>
+        <w:t>3a</w:t>
+      </w:r>
+      <w:r>
+        <w:rPr>
+          <w:lang w:val="en-GB"/>
+        </w:rPr>
+        <w:t xml:space="preserve">: </w:t>
+      </w:r>
+      <w:commentRangeStart w:id="12"/>
+      <w:r>
+        <w:rPr>
+          <w:lang w:val="en-GB"/>
+        </w:rPr>
+        <w:t>The cashier optionally applies a discount.</w:t>
+      </w:r>
+      <w:commentRangeEnd w:id="12"/>
+      <w:r>
+        <w:rPr>
+          <w:rStyle w:val="CommentReference"/>
+          <w:sz w:val="22"/>
+          <w:szCs w:val="22"/>
+          <w:lang w:val="en-GB"/>
+        </w:rPr>
+        <w:commentReference w:id="12"/>
       </w:r>
     </w:p>
     <w:p>
@@ -4931,14 +4967,16 @@
         </w:numPr>
         <w:spacing w:after="80" w:line="280" w:lineRule="auto"/>
         <w:rPr>
-          <w:lang w:val="en-GB"/>
-        </w:rPr>
-      </w:pPr>
-      <w:r>
-        <w:rPr>
-          <w:lang w:val="en-GB"/>
-        </w:rPr>
-        <w:t>Login screen — common to every role; on successful authentication the system reads the role from the user record and routes to the appropriate dashboard.</w:t>
+          <w:color w:val="EE0000"/>
+          <w:lang w:val="en-GB"/>
+        </w:rPr>
+      </w:pPr>
+      <w:r>
+        <w:rPr>
+          <w:color w:val="EE0000"/>
+          <w:lang w:val="en-GB"/>
+        </w:rPr>
+        <w:t>A: waiter</w:t>
       </w:r>
     </w:p>
     <w:p>
@@ -4950,14 +4988,16 @@
         </w:numPr>
         <w:spacing w:after="80" w:line="280" w:lineRule="auto"/>
         <w:rPr>
-          <w:lang w:val="en-GB"/>
-        </w:rPr>
-      </w:pPr>
-      <w:r>
-        <w:rPr>
-          <w:lang w:val="en-GB"/>
-        </w:rPr>
-        <w:t>Waiter dashboard — table selection, order composition, customization and free-text note attachment, order confirmation.</w:t>
+          <w:color w:val="4EA72E" w:themeColor="accent6"/>
+          <w:lang w:val="en-GB"/>
+        </w:rPr>
+      </w:pPr>
+      <w:r>
+        <w:rPr>
+          <w:color w:val="4EA72E" w:themeColor="accent6"/>
+          <w:lang w:val="en-GB"/>
+        </w:rPr>
+        <w:t>B: manager</w:t>
       </w:r>
     </w:p>
     <w:p>
@@ -4969,14 +5009,16 @@
         </w:numPr>
         <w:spacing w:after="80" w:line="280" w:lineRule="auto"/>
         <w:rPr>
-          <w:lang w:val="en-GB"/>
-        </w:rPr>
-      </w:pPr>
-      <w:r>
-        <w:rPr>
-          <w:lang w:val="en-GB"/>
-        </w:rPr>
-        <w:t>Manager dashboard — staff management, menu management (with add / edit / delete actions), financial reporting view, database configuration screen.</w:t>
+          <w:color w:val="7030A0"/>
+          <w:lang w:val="en-GB"/>
+        </w:rPr>
+      </w:pPr>
+      <w:r>
+        <w:rPr>
+          <w:color w:val="7030A0"/>
+          <w:lang w:val="en-GB"/>
+        </w:rPr>
+        <w:t>C: kitchen</w:t>
       </w:r>
     </w:p>
     <w:p>
@@ -4988,72 +5030,108 @@
         </w:numPr>
         <w:spacing w:after="80" w:line="280" w:lineRule="auto"/>
         <w:rPr>
-          <w:lang w:val="en-GB"/>
-        </w:rPr>
-      </w:pPr>
-      <w:r>
-        <w:rPr>
-          <w:lang w:val="en-GB"/>
-        </w:rPr>
-        <w:t>Kitchen dashboard — incoming orders filtered by the categories selected in the kitchen preferences; status update controls.</w:t>
-      </w:r>
-    </w:p>
-    <w:p>
-      <w:pPr>
-        <w:pStyle w:val="ListParagraph"/>
-        <w:numPr>
-          <w:ilvl w:val="0"/>
-          <w:numId w:val="2"/>
-        </w:numPr>
-        <w:spacing w:after="80" w:line="280" w:lineRule="auto"/>
-        <w:rPr>
-          <w:lang w:val="en-GB"/>
-        </w:rPr>
-      </w:pPr>
-      <w:r>
-        <w:rPr>
-          <w:lang w:val="en-GB"/>
-        </w:rPr>
-        <w:t>Cash desk dashboard — table selection, order summary with itemized prices, optional discount application and order closure.</w:t>
-      </w:r>
-    </w:p>
-    <w:p>
-      <w:pPr>
-        <w:pStyle w:val="ListParagraph"/>
-        <w:numPr>
-          <w:ilvl w:val="0"/>
-          <w:numId w:val="2"/>
-        </w:numPr>
-        <w:spacing w:after="80" w:line="280" w:lineRule="auto"/>
-        <w:rPr>
-          <w:lang w:val="en-GB"/>
-        </w:rPr>
-      </w:pPr>
-      <w:r>
-        <w:rPr>
-          <w:lang w:val="en-GB"/>
-        </w:rPr>
-        <w:t>Common controls — change-password and logout actions, available in every dashboard through a dedicated control in the navigation area.</w:t>
-      </w:r>
-    </w:p>
-    <w:p>
-      <w:pPr>
-        <w:rPr>
-          <w:lang w:val="en-GB"/>
-        </w:rPr>
-      </w:pPr>
+          <w:color w:val="FFC000"/>
+          <w:lang w:val="en-GB"/>
+        </w:rPr>
+      </w:pPr>
+      <w:r>
+        <w:rPr>
+          <w:color w:val="FFC000"/>
+          <w:lang w:val="en-GB"/>
+        </w:rPr>
+        <w:t>D: cashdesk</w:t>
+      </w:r>
+    </w:p>
+    <w:p>
+      <w:pPr>
+        <w:rPr>
+          <w:lang w:val="en-GB"/>
+        </w:rPr>
+      </w:pPr>
+      <w:commentRangeStart w:id="13"/>
       <w:r>
         <w:rPr>
           <w:noProof/>
+          <w:lang w:val="en-GB"/>
         </w:rPr>
         <w:drawing>
-          <wp:anchor distT="0" distB="0" distL="114300" distR="114300" simplePos="0" relativeHeight="251660288" behindDoc="1" locked="1" layoutInCell="1" allowOverlap="1" wp14:anchorId="42035202" wp14:editId="5EAA57F9">
+          <wp:anchor distT="0" distB="0" distL="114300" distR="114300" simplePos="0" relativeHeight="251658240" behindDoc="1" locked="0" layoutInCell="1" allowOverlap="1" wp14:anchorId="4D251EC9" wp14:editId="61F13D38">
             <wp:simplePos x="0" y="0"/>
             <wp:positionH relativeFrom="column">
-              <wp:posOffset>-215265</wp:posOffset>
+              <wp:posOffset>-212651</wp:posOffset>
+            </wp:positionH>
+            <wp:positionV relativeFrom="paragraph">
+              <wp:posOffset>86419</wp:posOffset>
+            </wp:positionV>
+            <wp:extent cx="6554449" cy="5153660"/>
+            <wp:effectExtent l="0" t="0" r="0" b="8890"/>
+            <wp:wrapNone/>
+            <wp:docPr id="950656356" name="Picture 1"/>
+            <wp:cNvGraphicFramePr>
+              <a:graphicFrameLocks xmlns:a="http://schemas.openxmlformats.org/drawingml/2006/main" noChangeAspect="1"/>
+            </wp:cNvGraphicFramePr>
+            <a:graphic xmlns:a="http://schemas.openxmlformats.org/drawingml/2006/main">
+              <a:graphicData uri="http://schemas.openxmlformats.org/drawingml/2006/picture">
+                <pic:pic xmlns:pic="http://schemas.openxmlformats.org/drawingml/2006/picture">
+                  <pic:nvPicPr>
+                    <pic:cNvPr id="950656356" name=""/>
+                    <pic:cNvPicPr/>
+                  </pic:nvPicPr>
+                  <pic:blipFill>
+                    <a:blip r:embed="rId12">
+                      <a:extLst>
+                        <a:ext uri="{28A0092B-C50C-407E-A947-70E740481C1C}">
+                          <a14:useLocalDpi xmlns:a14="http://schemas.microsoft.com/office/drawing/2010/main" val="0"/>
+                        </a:ext>
+                      </a:extLst>
+                    </a:blip>
+                    <a:stretch>
+                      <a:fillRect/>
+                    </a:stretch>
+                  </pic:blipFill>
+                  <pic:spPr>
+                    <a:xfrm>
+                      <a:off x="0" y="0"/>
+                      <a:ext cx="6567402" cy="5163845"/>
+                    </a:xfrm>
+                    <a:prstGeom prst="rect">
+                      <a:avLst/>
+                    </a:prstGeom>
+                  </pic:spPr>
+                </pic:pic>
+              </a:graphicData>
+            </a:graphic>
+            <wp14:sizeRelH relativeFrom="margin">
+              <wp14:pctWidth>0</wp14:pctWidth>
+            </wp14:sizeRelH>
+            <wp14:sizeRelV relativeFrom="margin">
+              <wp14:pctHeight>0</wp14:pctHeight>
+            </wp14:sizeRelV>
+          </wp:anchor>
+        </w:drawing>
+      </w:r>
+      <w:commentRangeEnd w:id="13"/>
+      <w:r>
+        <w:rPr>
+          <w:rStyle w:val="CommentReference"/>
+          <w:noProof/>
+          <w:sz w:val="22"/>
+          <w:szCs w:val="22"/>
+        </w:rPr>
+        <w:commentReference w:id="13"/>
+      </w:r>
+      <w:r>
+        <w:rPr>
+          <w:noProof/>
+        </w:rPr>
+        <w:drawing>
+          <wp:anchor distT="0" distB="0" distL="114300" distR="114300" simplePos="0" relativeHeight="251660288" behindDoc="1" locked="1" layoutInCell="1" allowOverlap="1" wp14:anchorId="42035202" wp14:editId="2F64CFB7">
+            <wp:simplePos x="0" y="0"/>
+            <wp:positionH relativeFrom="column">
+              <wp:posOffset>-213995</wp:posOffset>
             </wp:positionH>
             <wp:positionV relativeFrom="page">
-              <wp:posOffset>4705350</wp:posOffset>
+              <wp:posOffset>2992120</wp:posOffset>
             </wp:positionV>
             <wp:extent cx="6614795" cy="5403850"/>
             <wp:effectExtent l="19050" t="0" r="0" b="0"/>
@@ -5072,7 +5150,7 @@
                     </pic:cNvPicPr>
                   </pic:nvPicPr>
                   <pic:blipFill>
-                    <a:blip r:embed="rId12" cstate="print">
+                    <a:blip r:embed="rId13" cstate="print">
                       <a:extLst>
                         <a:ext uri="{28A0092B-C50C-407E-A947-70E740481C1C}">
                           <a14:useLocalDpi xmlns:a14="http://schemas.microsoft.com/office/drawing/2010/main" val="0"/>
@@ -5116,599 +5194,6 @@
           </wp:anchor>
         </w:drawing>
       </w:r>
-      <w:commentRangeStart w:id="15"/>
-      <w:r>
-        <w:rPr>
-          <w:noProof/>
-          <w:lang w:val="en-GB"/>
-        </w:rPr>
-        <w:drawing>
-          <wp:anchor distT="0" distB="0" distL="114300" distR="114300" simplePos="0" relativeHeight="251658240" behindDoc="1" locked="0" layoutInCell="1" allowOverlap="1" wp14:anchorId="4D251EC9" wp14:editId="27098F91">
-            <wp:simplePos x="0" y="0"/>
-            <wp:positionH relativeFrom="column">
-              <wp:posOffset>-214609</wp:posOffset>
-            </wp:positionH>
-            <wp:positionV relativeFrom="paragraph">
-              <wp:posOffset>88011</wp:posOffset>
-            </wp:positionV>
-            <wp:extent cx="6554743" cy="5153891"/>
-            <wp:effectExtent l="0" t="0" r="0" b="8890"/>
-            <wp:wrapNone/>
-            <wp:docPr id="950656356" name="Picture 1"/>
-            <wp:cNvGraphicFramePr>
-              <a:graphicFrameLocks xmlns:a="http://schemas.openxmlformats.org/drawingml/2006/main" noChangeAspect="1"/>
-            </wp:cNvGraphicFramePr>
-            <a:graphic xmlns:a="http://schemas.openxmlformats.org/drawingml/2006/main">
-              <a:graphicData uri="http://schemas.openxmlformats.org/drawingml/2006/picture">
-                <pic:pic xmlns:pic="http://schemas.openxmlformats.org/drawingml/2006/picture">
-                  <pic:nvPicPr>
-                    <pic:cNvPr id="950656356" name=""/>
-                    <pic:cNvPicPr/>
-                  </pic:nvPicPr>
-                  <pic:blipFill>
-                    <a:blip r:embed="rId13">
-                      <a:extLst>
-                        <a:ext uri="{28A0092B-C50C-407E-A947-70E740481C1C}">
-                          <a14:useLocalDpi xmlns:a14="http://schemas.microsoft.com/office/drawing/2010/main" val="0"/>
-                        </a:ext>
-                      </a:extLst>
-                    </a:blip>
-                    <a:stretch>
-                      <a:fillRect/>
-                    </a:stretch>
-                  </pic:blipFill>
-                  <pic:spPr>
-                    <a:xfrm>
-                      <a:off x="0" y="0"/>
-                      <a:ext cx="6554743" cy="5153891"/>
-                    </a:xfrm>
-                    <a:prstGeom prst="rect">
-                      <a:avLst/>
-                    </a:prstGeom>
-                  </pic:spPr>
-                </pic:pic>
-              </a:graphicData>
-            </a:graphic>
-            <wp14:sizeRelH relativeFrom="margin">
-              <wp14:pctWidth>0</wp14:pctWidth>
-            </wp14:sizeRelH>
-            <wp14:sizeRelV relativeFrom="margin">
-              <wp14:pctHeight>0</wp14:pctHeight>
-            </wp14:sizeRelV>
-          </wp:anchor>
-        </w:drawing>
-      </w:r>
-      <w:commentRangeEnd w:id="15"/>
-      <w:r>
-        <w:rPr>
-          <w:rStyle w:val="CommentReference"/>
-          <w:sz w:val="22"/>
-          <w:szCs w:val="22"/>
-          <w:lang w:val="en-GB"/>
-        </w:rPr>
-        <w:commentReference w:id="15"/>
-      </w:r>
-      <w:r>
-        <w:rPr>
-          <w:lang w:val="en-GB"/>
-        </w:rPr>
-        <w:br w:type="page"/>
-      </w:r>
-    </w:p>
-    <w:p>
-      <w:pPr>
-        <w:rPr>
-          <w:lang w:val="en-GB"/>
-        </w:rPr>
-      </w:pPr>
-      <w:commentRangeStart w:id="16"/>
-      <w:r>
-        <w:rPr>
-          <w:lang w:val="en-GB"/>
-        </w:rPr>
-        <w:lastRenderedPageBreak/>
-        <w:t xml:space="preserve"> After a simple login screen, depending on type of user the user will show a different dashboard:</w:t>
-      </w:r>
-    </w:p>
-    <w:p>
-      <w:pPr>
-        <w:pStyle w:val="ListParagraph"/>
-        <w:numPr>
-          <w:ilvl w:val="1"/>
-          <w:numId w:val="10"/>
-        </w:numPr>
-        <w:spacing w:after="160" w:line="278" w:lineRule="auto"/>
-        <w:contextualSpacing/>
-        <w:jc w:val="both"/>
-      </w:pPr>
-      <w:r>
-        <w:t>Waiter dashboard</w:t>
-      </w:r>
-    </w:p>
-    <w:p>
-      <w:pPr>
-        <w:pStyle w:val="ListParagraph"/>
-        <w:numPr>
-          <w:ilvl w:val="2"/>
-          <w:numId w:val="10"/>
-        </w:numPr>
-        <w:spacing w:after="160" w:line="278" w:lineRule="auto"/>
-        <w:contextualSpacing/>
-        <w:jc w:val="both"/>
-        <w:rPr>
-          <w:lang w:val="en-GB"/>
-        </w:rPr>
-      </w:pPr>
-      <w:r>
-        <w:rPr>
-          <w:lang w:val="en-GB"/>
-        </w:rPr>
-        <w:t xml:space="preserve">Is possible to </w:t>
-      </w:r>
-      <w:r>
-        <w:rPr>
-          <w:u w:val="single"/>
-          <w:lang w:val="en-GB"/>
-        </w:rPr>
-        <w:t>change password</w:t>
-      </w:r>
-      <w:r>
-        <w:rPr>
-          <w:lang w:val="en-GB"/>
-        </w:rPr>
-        <w:t xml:space="preserve"> (this option is available for every user in the left circle handle, </w:t>
-      </w:r>
-      <w:r>
-        <w:rPr>
-          <w:color w:val="E97132" w:themeColor="accent2"/>
-          <w:lang w:val="en-GB"/>
-        </w:rPr>
-        <w:t>so I won’t come repeated</w:t>
-      </w:r>
-      <w:r>
-        <w:rPr>
-          <w:lang w:val="en-GB"/>
-        </w:rPr>
-        <w:t>) whit a dedicated window</w:t>
-      </w:r>
-    </w:p>
-    <w:p>
-      <w:pPr>
-        <w:pStyle w:val="ListParagraph"/>
-        <w:numPr>
-          <w:ilvl w:val="2"/>
-          <w:numId w:val="10"/>
-        </w:numPr>
-        <w:spacing w:after="160" w:line="278" w:lineRule="auto"/>
-        <w:contextualSpacing/>
-        <w:jc w:val="both"/>
-        <w:rPr>
-          <w:lang w:val="en-GB"/>
-        </w:rPr>
-      </w:pPr>
-      <w:r>
-        <w:rPr>
-          <w:lang w:val="en-GB"/>
-        </w:rPr>
-        <w:t xml:space="preserve">Is possible to do a </w:t>
-      </w:r>
-      <w:r>
-        <w:rPr>
-          <w:u w:val="single"/>
-          <w:lang w:val="en-GB"/>
-        </w:rPr>
-        <w:t xml:space="preserve">logout </w:t>
-      </w:r>
-      <w:r>
-        <w:rPr>
-          <w:lang w:val="en-GB"/>
-        </w:rPr>
-        <w:t xml:space="preserve">whit specific handle (this option is available for every user il the left circle handle, </w:t>
-      </w:r>
-      <w:r>
-        <w:rPr>
-          <w:color w:val="E97132" w:themeColor="accent2"/>
-          <w:lang w:val="en-GB"/>
-        </w:rPr>
-        <w:t>so I won’t come repeated</w:t>
-      </w:r>
-      <w:r>
-        <w:rPr>
-          <w:lang w:val="en-GB"/>
-        </w:rPr>
-        <w:t>)</w:t>
-      </w:r>
-    </w:p>
-    <w:p>
-      <w:pPr>
-        <w:pStyle w:val="ListParagraph"/>
-        <w:numPr>
-          <w:ilvl w:val="2"/>
-          <w:numId w:val="10"/>
-        </w:numPr>
-        <w:spacing w:after="160" w:line="278" w:lineRule="auto"/>
-        <w:contextualSpacing/>
-        <w:jc w:val="both"/>
-        <w:rPr>
-          <w:lang w:val="en-GB"/>
-        </w:rPr>
-      </w:pPr>
-      <w:r>
-        <w:rPr>
-          <w:lang w:val="en-GB"/>
-        </w:rPr>
-        <w:t xml:space="preserve">Is possible to </w:t>
-      </w:r>
-      <w:r>
-        <w:rPr>
-          <w:lang w:val="en-GB"/>
-        </w:rPr>
-        <w:t>choose</w:t>
-      </w:r>
-      <w:r>
-        <w:rPr>
-          <w:lang w:val="en-GB"/>
-        </w:rPr>
-        <w:t xml:space="preserve"> what table manage, so only the order (to deliver) related to a selected table will be showed</w:t>
-      </w:r>
-    </w:p>
-    <w:p>
-      <w:pPr>
-        <w:pStyle w:val="ListParagraph"/>
-        <w:numPr>
-          <w:ilvl w:val="2"/>
-          <w:numId w:val="10"/>
-        </w:numPr>
-        <w:spacing w:after="160" w:line="278" w:lineRule="auto"/>
-        <w:contextualSpacing/>
-        <w:jc w:val="both"/>
-        <w:rPr>
-          <w:lang w:val="en-GB"/>
-        </w:rPr>
-      </w:pPr>
-      <w:r>
-        <w:rPr>
-          <w:lang w:val="en-GB"/>
-        </w:rPr>
-        <w:t>Is possible to go in a view that allows you to choose the products that will make up the order</w:t>
-      </w:r>
-    </w:p>
-    <w:p>
-      <w:pPr>
-        <w:pStyle w:val="ListParagraph"/>
-        <w:numPr>
-          <w:ilvl w:val="3"/>
-          <w:numId w:val="10"/>
-        </w:numPr>
-        <w:spacing w:after="160" w:line="278" w:lineRule="auto"/>
-        <w:contextualSpacing/>
-        <w:jc w:val="both"/>
-        <w:rPr>
-          <w:lang w:val="en-GB"/>
-        </w:rPr>
-      </w:pPr>
-      <w:r>
-        <w:rPr>
-          <w:lang w:val="en-GB"/>
-        </w:rPr>
-        <w:t>Is showed a confirm page, where is possible to write a note</w:t>
-      </w:r>
-    </w:p>
-    <w:p>
-      <w:pPr>
-        <w:pStyle w:val="ListParagraph"/>
-        <w:numPr>
-          <w:ilvl w:val="1"/>
-          <w:numId w:val="10"/>
-        </w:numPr>
-        <w:spacing w:after="160" w:line="278" w:lineRule="auto"/>
-        <w:contextualSpacing/>
-        <w:jc w:val="both"/>
-      </w:pPr>
-      <w:r>
-        <w:t>Manager dashboard</w:t>
-      </w:r>
-    </w:p>
-    <w:p>
-      <w:pPr>
-        <w:pStyle w:val="ListParagraph"/>
-        <w:numPr>
-          <w:ilvl w:val="2"/>
-          <w:numId w:val="10"/>
-        </w:numPr>
-        <w:spacing w:after="160" w:line="278" w:lineRule="auto"/>
-        <w:contextualSpacing/>
-        <w:jc w:val="both"/>
-        <w:rPr>
-          <w:lang w:val="en-GB"/>
-        </w:rPr>
-      </w:pPr>
-      <w:r>
-        <w:rPr>
-          <w:lang w:val="en-GB"/>
-        </w:rPr>
-        <w:t>Is possible to open a dashboard to manage the worker in the activity (insert new user, delete users, see what users exist and what role they have)</w:t>
-      </w:r>
-    </w:p>
-    <w:p>
-      <w:pPr>
-        <w:pStyle w:val="ListParagraph"/>
-        <w:numPr>
-          <w:ilvl w:val="2"/>
-          <w:numId w:val="10"/>
-        </w:numPr>
-        <w:spacing w:after="160" w:line="278" w:lineRule="auto"/>
-        <w:contextualSpacing/>
-        <w:jc w:val="both"/>
-        <w:rPr>
-          <w:lang w:val="en-GB"/>
-        </w:rPr>
-      </w:pPr>
-      <w:r>
-        <w:rPr>
-          <w:lang w:val="en-GB"/>
-        </w:rPr>
-        <w:t>Is possible to go in a screen dedicated to the menu, that show what product there are in that</w:t>
-      </w:r>
-    </w:p>
-    <w:p>
-      <w:pPr>
-        <w:pStyle w:val="ListParagraph"/>
-        <w:numPr>
-          <w:ilvl w:val="3"/>
-          <w:numId w:val="10"/>
-        </w:numPr>
-        <w:spacing w:after="160" w:line="278" w:lineRule="auto"/>
-        <w:contextualSpacing/>
-        <w:jc w:val="both"/>
-      </w:pPr>
-      <w:r>
-        <w:t>Add new product (pressing: “+”)</w:t>
-      </w:r>
-    </w:p>
-    <w:p>
-      <w:pPr>
-        <w:pStyle w:val="ListParagraph"/>
-        <w:numPr>
-          <w:ilvl w:val="3"/>
-          <w:numId w:val="10"/>
-        </w:numPr>
-        <w:spacing w:after="160" w:line="278" w:lineRule="auto"/>
-        <w:contextualSpacing/>
-        <w:jc w:val="both"/>
-        <w:rPr>
-          <w:lang w:val="en-GB"/>
-        </w:rPr>
-      </w:pPr>
-      <w:r>
-        <w:rPr>
-          <w:lang w:val="en-GB"/>
-        </w:rPr>
-        <w:t>See detail (“clicking” on a row)</w:t>
-      </w:r>
-    </w:p>
-    <w:p>
-      <w:pPr>
-        <w:pStyle w:val="ListParagraph"/>
-        <w:numPr>
-          <w:ilvl w:val="2"/>
-          <w:numId w:val="10"/>
-        </w:numPr>
-        <w:spacing w:after="160" w:line="278" w:lineRule="auto"/>
-        <w:contextualSpacing/>
-        <w:jc w:val="both"/>
-        <w:rPr>
-          <w:b/>
-          <w:bCs/>
-          <w:lang w:val="en-GB"/>
-        </w:rPr>
-      </w:pPr>
-      <w:r>
-        <w:rPr>
-          <w:lang w:val="en-GB"/>
-        </w:rPr>
-        <w:t xml:space="preserve">Il possible to go in a </w:t>
-      </w:r>
-      <w:r>
-        <w:rPr>
-          <w:b/>
-          <w:bCs/>
-          <w:lang w:val="en-GB"/>
-        </w:rPr>
-        <w:t>screen dedicated to see the order history: “financial”</w:t>
-      </w:r>
-    </w:p>
-    <w:p>
-      <w:pPr>
-        <w:pStyle w:val="ListParagraph"/>
-        <w:numPr>
-          <w:ilvl w:val="3"/>
-          <w:numId w:val="10"/>
-        </w:numPr>
-        <w:spacing w:after="160" w:line="278" w:lineRule="auto"/>
-        <w:contextualSpacing/>
-        <w:jc w:val="both"/>
-        <w:rPr>
-          <w:b/>
-          <w:bCs/>
-          <w:lang w:val="en-GB"/>
-        </w:rPr>
-      </w:pPr>
-      <w:r>
-        <w:rPr>
-          <w:b/>
-          <w:bCs/>
-          <w:lang w:val="en-GB"/>
-        </w:rPr>
-        <w:t>See detail (“clicking” on a row)</w:t>
-      </w:r>
-    </w:p>
-    <w:p>
-      <w:pPr>
-        <w:pStyle w:val="ListParagraph"/>
-        <w:numPr>
-          <w:ilvl w:val="1"/>
-          <w:numId w:val="10"/>
-        </w:numPr>
-        <w:spacing w:after="160" w:line="278" w:lineRule="auto"/>
-        <w:contextualSpacing/>
-        <w:jc w:val="both"/>
-        <w:rPr>
-          <w:b/>
-          <w:bCs/>
-        </w:rPr>
-      </w:pPr>
-      <w:r>
-        <w:rPr>
-          <w:b/>
-          <w:bCs/>
-        </w:rPr>
-        <w:t>Kitchen dashboard</w:t>
-      </w:r>
-    </w:p>
-    <w:p>
-      <w:pPr>
-        <w:pStyle w:val="ListParagraph"/>
-        <w:numPr>
-          <w:ilvl w:val="2"/>
-          <w:numId w:val="10"/>
-        </w:numPr>
-        <w:spacing w:after="160" w:line="278" w:lineRule="auto"/>
-        <w:contextualSpacing/>
-        <w:jc w:val="both"/>
-        <w:rPr>
-          <w:b/>
-          <w:bCs/>
-          <w:lang w:val="en-GB"/>
-        </w:rPr>
-      </w:pPr>
-      <w:r>
-        <w:rPr>
-          <w:b/>
-          <w:bCs/>
-          <w:lang w:val="en-GB"/>
-        </w:rPr>
-        <w:t xml:space="preserve">Is possible to navigate to a preference screen that allows the user to choose what category of order show </w:t>
-      </w:r>
-      <w:r>
-        <w:rPr>
-          <w:b/>
-          <w:bCs/>
-          <w:color w:val="156082" w:themeColor="accent1"/>
-          <w:lang w:val="en-GB"/>
-        </w:rPr>
-        <w:t>(if there are more user “kitchen” they can divide work by category, and each one can see their own)</w:t>
-      </w:r>
-    </w:p>
-    <w:p>
-      <w:pPr>
-        <w:pStyle w:val="ListParagraph"/>
-        <w:numPr>
-          <w:ilvl w:val="1"/>
-          <w:numId w:val="10"/>
-        </w:numPr>
-        <w:spacing w:after="160" w:line="278" w:lineRule="auto"/>
-        <w:contextualSpacing/>
-        <w:jc w:val="both"/>
-        <w:rPr>
-          <w:b/>
-          <w:bCs/>
-          <w:lang w:val="en-GB"/>
-        </w:rPr>
-      </w:pPr>
-      <w:r>
-        <w:rPr>
-          <w:b/>
-          <w:bCs/>
-          <w:u w:val="single"/>
-          <w:lang w:val="en-GB"/>
-        </w:rPr>
-        <w:t>cash desk</w:t>
-      </w:r>
-      <w:r>
-        <w:rPr>
-          <w:b/>
-          <w:bCs/>
-          <w:lang w:val="en-GB"/>
-        </w:rPr>
-        <w:t>: can see detail and close order</w:t>
-      </w:r>
-    </w:p>
-    <w:p>
-      <w:pPr>
-        <w:pStyle w:val="ListParagraph"/>
-        <w:numPr>
-          <w:ilvl w:val="1"/>
-          <w:numId w:val="10"/>
-        </w:numPr>
-        <w:spacing w:after="160" w:line="278" w:lineRule="auto"/>
-        <w:contextualSpacing/>
-        <w:jc w:val="both"/>
-        <w:rPr>
-          <w:b/>
-          <w:bCs/>
-          <w:lang w:val="en-GB"/>
-        </w:rPr>
-      </w:pPr>
-      <w:r>
-        <w:rPr>
-          <w:b/>
-          <w:bCs/>
-          <w:lang w:val="en-GB"/>
-        </w:rPr>
-        <w:t xml:space="preserve">there in furthermore a screen dedicated to </w:t>
-      </w:r>
-      <w:r>
-        <w:rPr>
-          <w:b/>
-          <w:bCs/>
-          <w:lang w:val="en-GB"/>
-        </w:rPr>
-        <w:t>configuring</w:t>
-      </w:r>
-      <w:r>
-        <w:rPr>
-          <w:b/>
-          <w:bCs/>
-          <w:lang w:val="en-GB"/>
-        </w:rPr>
-        <w:t xml:space="preserve"> </w:t>
-      </w:r>
-      <w:r>
-        <w:rPr>
-          <w:b/>
-          <w:bCs/>
-          <w:lang w:val="en-GB"/>
-        </w:rPr>
-        <w:t xml:space="preserve">connection to </w:t>
-      </w:r>
-      <w:r>
-        <w:rPr>
-          <w:b/>
-          <w:bCs/>
-          <w:lang w:val="en-GB"/>
-        </w:rPr>
-        <w:t>DB</w:t>
-      </w:r>
-      <w:commentRangeEnd w:id="16"/>
-      <w:r>
-        <w:rPr>
-          <w:rStyle w:val="CommentReference"/>
-          <w:b/>
-          <w:bCs/>
-          <w:sz w:val="22"/>
-          <w:szCs w:val="22"/>
-          <w:lang w:val="en-GB"/>
-        </w:rPr>
-        <w:commentReference w:id="16"/>
-      </w:r>
-    </w:p>
-    <w:p>
-      <w:pPr>
-        <w:rPr>
-          <w:lang w:val="en-GB"/>
-        </w:rPr>
-      </w:pPr>
       <w:r>
         <w:rPr>
           <w:lang w:val="en-GB"/>
@@ -5778,8 +5263,8 @@
         <w:tblLook w:val="04A0" w:firstRow="1" w:lastRow="0" w:firstColumn="1" w:lastColumn="0" w:noHBand="0" w:noVBand="1"/>
       </w:tblPr>
       <w:tblGrid>
-        <w:gridCol w:w="2883"/>
-        <w:gridCol w:w="6477"/>
+        <w:gridCol w:w="2880"/>
+        <w:gridCol w:w="6480"/>
       </w:tblGrid>
       <w:tr>
         <w:trPr>
@@ -5869,22 +5354,22 @@
             <w:pPr>
               <w:spacing w:line="280" w:lineRule="auto"/>
             </w:pPr>
-            <w:commentRangeStart w:id="17"/>
+            <w:commentRangeStart w:id="14"/>
             <w:r>
               <w:rPr>
                 <w:b/>
                 <w:bCs/>
               </w:rPr>
-              <w:t>com.example.rm.app</w:t>
+              <w:t>rm.app</w:t>
             </w:r>
-            <w:commentRangeEnd w:id="17"/>
+            <w:commentRangeEnd w:id="14"/>
             <w:r>
               <w:rPr>
                 <w:rStyle w:val="CommentReference"/>
                 <w:sz w:val="22"/>
                 <w:szCs w:val="22"/>
               </w:rPr>
-              <w:commentReference w:id="17"/>
+              <w:commentReference w:id="14"/>
             </w:r>
           </w:p>
         </w:tc>
@@ -5947,7 +5432,7 @@
                 <w:b/>
                 <w:bCs/>
               </w:rPr>
-              <w:t>com.example.rm.bean</w:t>
+              <w:t>rm.bean</w:t>
             </w:r>
           </w:p>
         </w:tc>
@@ -6010,7 +5495,7 @@
                 <w:b/>
                 <w:bCs/>
               </w:rPr>
-              <w:t>com.example.rm.controller</w:t>
+              <w:t>rm.controller</w:t>
             </w:r>
           </w:p>
         </w:tc>
@@ -6073,7 +5558,7 @@
                 <w:b/>
                 <w:bCs/>
               </w:rPr>
-              <w:t>com.example.rm.dao</w:t>
+              <w:t>rm.dao</w:t>
             </w:r>
           </w:p>
         </w:tc>
@@ -6136,7 +5621,7 @@
                 <w:b/>
                 <w:bCs/>
               </w:rPr>
-              <w:t>com.example.rm.exception</w:t>
+              <w:t>rm.exception</w:t>
             </w:r>
           </w:p>
         </w:tc>
@@ -6193,7 +5678,7 @@
                 <w:b/>
                 <w:bCs/>
               </w:rPr>
-              <w:t>com.example.rm.model</w:t>
+              <w:t>rm.model</w:t>
             </w:r>
           </w:p>
         </w:tc>
@@ -6256,7 +5741,7 @@
                 <w:b/>
                 <w:bCs/>
               </w:rPr>
-              <w:t>com.example.rm.preference</w:t>
+              <w:t>rm.preference</w:t>
             </w:r>
           </w:p>
         </w:tc>
@@ -6319,7 +5804,7 @@
                 <w:b/>
                 <w:bCs/>
               </w:rPr>
-              <w:t>com.example.rm.service</w:t>
+              <w:t>rm.service</w:t>
             </w:r>
           </w:p>
         </w:tc>
@@ -6382,7 +5867,7 @@
                 <w:b/>
                 <w:bCs/>
               </w:rPr>
-              <w:t>com.example.rm.view</w:t>
+              <w:t>rm.view</w:t>
             </w:r>
           </w:p>
         </w:tc>
@@ -6511,107 +5996,6 @@
         </w:rPr>
       </w:pPr>
     </w:p>
-    <w:tbl>
-      <w:tblPr>
-        <w:tblW w:w="9360" w:type="dxa"/>
-        <w:tblBorders>
-          <w:top w:val="single" w:sz="4" w:space="0" w:color="auto"/>
-          <w:left w:val="single" w:sz="4" w:space="0" w:color="auto"/>
-          <w:bottom w:val="single" w:sz="4" w:space="0" w:color="auto"/>
-          <w:right w:val="single" w:sz="4" w:space="0" w:color="auto"/>
-          <w:insideH w:val="single" w:sz="4" w:space="0" w:color="auto"/>
-          <w:insideV w:val="single" w:sz="4" w:space="0" w:color="auto"/>
-        </w:tblBorders>
-        <w:tblCellMar>
-          <w:left w:w="10" w:type="dxa"/>
-          <w:right w:w="10" w:type="dxa"/>
-        </w:tblCellMar>
-        <w:tblLook w:val="04A0" w:firstRow="1" w:lastRow="0" w:firstColumn="1" w:lastColumn="0" w:noHBand="0" w:noVBand="1"/>
-      </w:tblPr>
-      <w:tblGrid>
-        <w:gridCol w:w="9360"/>
-      </w:tblGrid>
-      <w:tr>
-        <w:tc>
-          <w:tcPr>
-            <w:tcW w:w="9360" w:type="dxa"/>
-            <w:tcBorders>
-              <w:top w:val="dashed" w:sz="8" w:space="0" w:color="C0392B"/>
-              <w:left w:val="dashed" w:sz="8" w:space="0" w:color="C0392B"/>
-              <w:bottom w:val="dashed" w:sz="8" w:space="0" w:color="C0392B"/>
-              <w:right w:val="dashed" w:sz="8" w:space="0" w:color="C0392B"/>
-            </w:tcBorders>
-            <w:shd w:val="clear" w:color="auto" w:fill="F4F4F4"/>
-            <w:tcMar>
-              <w:top w:w="240" w:type="dxa"/>
-              <w:left w:w="200" w:type="dxa"/>
-              <w:bottom w:w="240" w:type="dxa"/>
-              <w:right w:w="200" w:type="dxa"/>
-            </w:tcMar>
-          </w:tcPr>
-          <w:p>
-            <w:pPr>
-              <w:jc w:val="center"/>
-              <w:rPr>
-                <w:lang w:val="en-GB"/>
-              </w:rPr>
-            </w:pPr>
-            <w:commentRangeStart w:id="18"/>
-            <w:r>
-              <w:rPr>
-                <w:b/>
-                <w:bCs/>
-                <w:color w:val="C0392B"/>
-                <w:lang w:val="en-GB"/>
-              </w:rPr>
-              <w:t xml:space="preserve">[ Diagram placeholder </w:t>
-            </w:r>
-            <w:commentRangeEnd w:id="18"/>
-            <w:r>
-              <w:rPr>
-                <w:rStyle w:val="CommentReference"/>
-                <w:b/>
-                <w:bCs/>
-                <w:color w:val="C0392B"/>
-                <w:sz w:val="22"/>
-                <w:szCs w:val="22"/>
-                <w:lang w:val="en-GB"/>
-              </w:rPr>
-              <w:commentReference w:id="18"/>
-            </w:r>
-            <w:r>
-              <w:rPr>
-                <w:b/>
-                <w:bCs/>
-                <w:color w:val="C0392B"/>
-                <w:lang w:val="en-GB"/>
-              </w:rPr>
-              <w:t>]</w:t>
-            </w:r>
-          </w:p>
-          <w:p>
-            <w:pPr>
-              <w:spacing w:before="60"/>
-              <w:jc w:val="center"/>
-              <w:rPr>
-                <w:lang w:val="en-GB"/>
-              </w:rPr>
-            </w:pPr>
-            <w:r>
-              <w:rPr>
-                <w:i/>
-                <w:iCs/>
-                <w:color w:val="666666"/>
-                <w:sz w:val="20"/>
-                <w:szCs w:val="20"/>
-                <w:lang w:val="en-GB"/>
-              </w:rPr>
-              <w:t>Figure 9 — Design-Level Class Diagram — to be inserted</w:t>
-            </w:r>
-          </w:p>
-        </w:tc>
-      </w:tr>
-    </w:tbl>
     <w:p>
       <w:pPr>
         <w:pStyle w:val="Heading3"/>
@@ -6717,7 +6101,6 @@
           <w:bCs/>
           <w:lang w:val="en-GB"/>
         </w:rPr>
-        <w:lastRenderedPageBreak/>
         <w:t xml:space="preserve">Factory Method Pattern. </w:t>
       </w:r>
     </w:p>
@@ -6733,6 +6116,7 @@
         <w:rPr>
           <w:lang w:val="en-GB"/>
         </w:rPr>
+        <w:lastRenderedPageBreak/>
         <w:t xml:space="preserve">The Factory Method pattern is applied to encapsulate object creation logic and to decouple client code from concrete implementations. The </w:t>
       </w:r>
       <w:r>
@@ -6849,7 +6233,7 @@
           <w:lang w:val="en-GB"/>
         </w:rPr>
       </w:pPr>
-      <w:commentRangeStart w:id="19"/>
+      <w:commentRangeStart w:id="15"/>
       <w:r>
         <w:rPr>
           <w:b/>
@@ -6858,7 +6242,7 @@
         </w:rPr>
         <w:t>DAO (Data Access Object) Pattern</w:t>
       </w:r>
-      <w:commentRangeEnd w:id="19"/>
+      <w:commentRangeEnd w:id="15"/>
       <w:r>
         <w:rPr>
           <w:rStyle w:val="CommentReference"/>
@@ -6868,7 +6252,7 @@
           <w:szCs w:val="22"/>
           <w:lang w:val="en-GB"/>
         </w:rPr>
-        <w:commentReference w:id="19"/>
+        <w:commentReference w:id="15"/>
       </w:r>
       <w:r>
         <w:rPr>
@@ -7069,7 +6453,7 @@
           <w:lang w:val="en-GB"/>
         </w:rPr>
       </w:pPr>
-      <w:commentRangeStart w:id="20"/>
+      <w:commentRangeStart w:id="16"/>
       <w:r>
         <w:rPr>
           <w:lang w:val="en-GB"/>
@@ -7121,7 +6505,7 @@
         </w:rPr>
         <w:t>. By receiving DAO interfaces rather than concrete implementations, these classes remain loosely coupled to the persistence layer and can be exercised in isolation by injecting mock or alternative implementations during testing</w:t>
       </w:r>
-      <w:commentRangeEnd w:id="20"/>
+      <w:commentRangeEnd w:id="16"/>
       <w:r>
         <w:rPr>
           <w:rStyle w:val="CommentReference"/>
@@ -7129,7 +6513,7 @@
           <w:szCs w:val="22"/>
           <w:lang w:val="en-GB"/>
         </w:rPr>
-        <w:commentReference w:id="20"/>
+        <w:commentReference w:id="16"/>
       </w:r>
       <w:r>
         <w:rPr>
@@ -7373,7 +6757,6 @@
                 <w:color w:val="C0392B"/>
                 <w:lang w:val="en-GB"/>
               </w:rPr>
-              <w:lastRenderedPageBreak/>
               <w:t>[ Diagram placeholder ]</w:t>
             </w:r>
           </w:p>
@@ -7394,6 +6777,7 @@
                 <w:szCs w:val="20"/>
                 <w:lang w:val="en-GB"/>
               </w:rPr>
+              <w:lastRenderedPageBreak/>
               <w:t>Figure 10 — Activity Diagram: Create Order</w:t>
             </w:r>
           </w:p>
@@ -8299,14 +7683,14 @@
         <w:lastRenderedPageBreak/>
         <w:t xml:space="preserve">5. </w:t>
       </w:r>
-      <w:commentRangeStart w:id="21"/>
+      <w:commentRangeStart w:id="17"/>
       <w:r>
         <w:rPr>
           <w:lang w:val="en-GB"/>
         </w:rPr>
         <w:t>EXCEPTIONS</w:t>
       </w:r>
-      <w:commentRangeEnd w:id="21"/>
+      <w:commentRangeEnd w:id="17"/>
       <w:r>
         <w:rPr>
           <w:rStyle w:val="CommentReference"/>
@@ -8314,7 +7698,7 @@
           <w:szCs w:val="36"/>
           <w:lang w:val="en-GB"/>
         </w:rPr>
-        <w:commentReference w:id="21"/>
+        <w:commentReference w:id="17"/>
       </w:r>
     </w:p>
     <w:p>
@@ -9451,7 +8835,7 @@
       </w:r>
     </w:p>
   </w:comment>
-  <w:comment w:id="11" w:author="davide brugnoli" w:date="2026-05-26T15:30:00Z" w:initials="db">
+  <w:comment w:id="11" w:author="davide brugnoli" w:date="2026-06-03T12:18:00Z" w:initials="db">
     <w:p>
       <w:pPr>
         <w:pStyle w:val="CommentText"/>
@@ -9463,11 +8847,11 @@
         <w:annotationRef/>
       </w:r>
       <w:r>
-        <w:t>Da reinserire la versione più recente, che non riporta 2 volte add</w:t>
+        <w:t>Altri progetti ce l’hanno</w:t>
       </w:r>
     </w:p>
   </w:comment>
-  <w:comment w:id="12" w:author="davide brugnoli" w:date="2026-05-26T15:32:00Z" w:initials="db">
+  <w:comment w:id="12" w:author="davide brugnoli" w:date="2026-04-30T12:11:00Z" w:initials="db">
     <w:p>
       <w:pPr>
         <w:pStyle w:val="CommentText"/>
@@ -9479,11 +8863,11 @@
         <w:annotationRef/>
       </w:r>
       <w:r>
-        <w:t>Revisiona: filter by table, possibilità di incomprensione</w:t>
+        <w:t>Potrebbe esssrre un extend?</w:t>
       </w:r>
     </w:p>
   </w:comment>
-  <w:comment w:id="13" w:author="davide brugnoli" w:date="2026-04-30T12:11:00Z" w:initials="db">
+  <w:comment w:id="13" w:author="davide brugnoli" w:date="2026-04-30T12:15:00Z" w:initials="db">
     <w:p>
       <w:pPr>
         <w:pStyle w:val="CommentText"/>
@@ -9495,11 +8879,11 @@
         <w:annotationRef/>
       </w:r>
       <w:r>
-        <w:t>Potrebbe esssrre un extend?</w:t>
+        <w:t>Inserire un immagine a qualità superiore</w:t>
       </w:r>
     </w:p>
   </w:comment>
-  <w:comment w:id="14" w:author="davide brugnoli" w:date="2026-04-30T12:11:00Z" w:initials="db">
+  <w:comment w:id="14" w:author="davide brugnoli" w:date="2026-05-26T15:44:00Z" w:initials="db">
     <w:p>
       <w:pPr>
         <w:pStyle w:val="CommentText"/>
@@ -9511,11 +8895,11 @@
         <w:annotationRef/>
       </w:r>
       <w:r>
-        <w:t>Potrebbe esssrre un extend?</w:t>
+        <w:t>Controlla se altri progetti usano com.example.rm.app</w:t>
       </w:r>
     </w:p>
   </w:comment>
-  <w:comment w:id="15" w:author="davide brugnoli" w:date="2026-04-30T12:15:00Z" w:initials="db">
+  <w:comment w:id="15" w:author="davide brugnoli" w:date="2026-05-26T15:46:00Z" w:initials="db">
     <w:p>
       <w:pPr>
         <w:pStyle w:val="CommentText"/>
@@ -9527,11 +8911,11 @@
         <w:annotationRef/>
       </w:r>
       <w:r>
-        <w:t>Inserire un immagine a qualità superiore</w:t>
+        <w:t>I DAO sono pattern?</w:t>
       </w:r>
     </w:p>
   </w:comment>
-  <w:comment w:id="16" w:author="davide brugnoli" w:date="2026-06-03T11:04:00Z" w:initials="db">
+  <w:comment w:id="16" w:author="davide brugnoli" w:date="2026-05-26T15:48:00Z" w:initials="db">
     <w:p>
       <w:pPr>
         <w:pStyle w:val="CommentText"/>
@@ -9543,75 +8927,11 @@
         <w:annotationRef/>
       </w:r>
       <w:r>
-        <w:t>Da rimuovere</w:t>
+        <w:t>Rileggi bene</w:t>
       </w:r>
     </w:p>
   </w:comment>
-  <w:comment w:id="17" w:author="davide brugnoli" w:date="2026-05-26T15:44:00Z" w:initials="db">
-    <w:p>
-      <w:pPr>
-        <w:pStyle w:val="CommentText"/>
-      </w:pPr>
-      <w:r>
-        <w:rPr>
-          <w:rStyle w:val="CommentReference"/>
-        </w:rPr>
-        <w:annotationRef/>
-      </w:r>
-      <w:r>
-        <w:t>Controlla se altri progetti usano com.example.rm.app</w:t>
-      </w:r>
-    </w:p>
-  </w:comment>
-  <w:comment w:id="18" w:author="davide brugnoli" w:date="2026-05-26T15:45:00Z" w:initials="db">
-    <w:p>
-      <w:pPr>
-        <w:pStyle w:val="CommentText"/>
-      </w:pPr>
-      <w:r>
-        <w:rPr>
-          <w:rStyle w:val="CommentReference"/>
-        </w:rPr>
-        <w:annotationRef/>
-      </w:r>
-      <w:r>
-        <w:t>Non inseriremo il Design Level</w:t>
-      </w:r>
-    </w:p>
-  </w:comment>
-  <w:comment w:id="19" w:author="davide brugnoli" w:date="2026-05-26T15:46:00Z" w:initials="db">
-    <w:p>
-      <w:pPr>
-        <w:pStyle w:val="CommentText"/>
-      </w:pPr>
-      <w:r>
-        <w:rPr>
-          <w:rStyle w:val="CommentReference"/>
-        </w:rPr>
-        <w:annotationRef/>
-      </w:r>
-      <w:r>
-        <w:t>I DAO sono pattern?</w:t>
-      </w:r>
-    </w:p>
-  </w:comment>
-  <w:comment w:id="20" w:author="davide brugnoli" w:date="2026-05-26T15:48:00Z" w:initials="db">
-    <w:p>
-      <w:pPr>
-        <w:pStyle w:val="CommentText"/>
-      </w:pPr>
-      <w:r>
-        <w:rPr>
-          <w:rStyle w:val="CommentReference"/>
-        </w:rPr>
-        <w:annotationRef/>
-      </w:r>
-      <w:r>
-        <w:t>Rileggi bene</w:t>
-      </w:r>
-    </w:p>
-  </w:comment>
-  <w:comment w:id="21" w:author="davide brugnoli" w:date="2026-05-26T15:53:00Z" w:initials="db">
+  <w:comment w:id="17" w:author="davide brugnoli" w:date="2026-05-26T15:53:00Z" w:initials="db">
     <w:p>
       <w:pPr>
         <w:pStyle w:val="CommentText"/>
@@ -9638,19 +8958,15 @@
   <w15:commentEx w15:paraId="55E1E209" w15:paraIdParent="5DABDE37" w15:done="0"/>
   <w15:commentEx w15:paraId="63C32BE6" w15:done="0"/>
   <w15:commentEx w15:paraId="5ABC12F1" w15:done="0"/>
-  <w15:commentEx w15:paraId="06108AB1" w15:done="0"/>
+  <w15:commentEx w15:paraId="06108AB1" w15:done="1"/>
   <w15:commentEx w15:paraId="6948B227" w15:done="0"/>
-  <w15:commentEx w15:paraId="2ECF85D9" w15:done="0"/>
+  <w15:commentEx w15:paraId="2ECF85D9" w15:done="1"/>
   <w15:commentEx w15:paraId="23F9DCC9" w15:done="0"/>
   <w15:commentEx w15:paraId="36AB0C9D" w15:done="0"/>
-  <w15:commentEx w15:paraId="5A4F53AA" w15:done="0"/>
-  <w15:commentEx w15:paraId="38391F09" w15:paraIdParent="5A4F53AA" w15:done="0"/>
-  <w15:commentEx w15:paraId="43FA236F" w15:done="0"/>
-  <w15:commentEx w15:paraId="62075B69" w15:done="0"/>
-  <w15:commentEx w15:paraId="0BD793F5" w15:done="0"/>
-  <w15:commentEx w15:paraId="56CDDAF6" w15:done="0"/>
-  <w15:commentEx w15:paraId="47FB3CB4" w15:done="0"/>
-  <w15:commentEx w15:paraId="7D039CDD" w15:done="0"/>
+  <w15:commentEx w15:paraId="1ABBCD74" w15:paraIdParent="36AB0C9D" w15:done="0"/>
+  <w15:commentEx w15:paraId="46443DE5" w15:done="1"/>
+  <w15:commentEx w15:paraId="2CA708E2" w15:done="1"/>
+  <w15:commentEx w15:paraId="47FB3CB4" w15:done="1"/>
   <w15:commentEx w15:paraId="61D113FC" w15:done="0"/>
   <w15:commentEx w15:paraId="0EB5BDA6" w15:done="0"/>
   <w15:commentEx w15:paraId="5D12BDB0" w15:done="0"/>
@@ -9677,17 +8993,12 @@
   <w16cex:commentExtensible w16cex:durableId="4DF94135" w16cex:dateUtc="2026-06-01T16:02:00Z"/>
   <w16cex:commentExtensible w16cex:durableId="5AB1A90F" w16cex:dateUtc="2026-04-30T09:50:00Z"/>
   <w16cex:commentExtensible w16cex:durableId="223CE331" w16cex:dateUtc="2026-04-30T09:50:00Z"/>
-  <w16cex:commentExtensible w16cex:durableId="66A7F010" w16cex:dateUtc="2026-05-26T13:25:00Z"/>
-  <w16cex:commentExtensible w16cex:durableId="643AFE80" w16cex:dateUtc="2026-05-26T13:28:00Z"/>
-  <w16cex:commentExtensible w16cex:durableId="1602E17F" w16cex:dateUtc="2026-06-01T15:52:00Z"/>
-  <w16cex:commentExtensible w16cex:durableId="6D76DFA0" w16cex:dateUtc="2026-04-30T09:58:00Z"/>
-  <w16cex:commentExtensible w16cex:durableId="4CCF2757" w16cex:dateUtc="2026-05-26T13:29:00Z"/>
-  <w16cex:commentExtensible w16cex:durableId="3DC8BF16" w16cex:dateUtc="2026-05-26T13:30:00Z">
+  <w16cex:commentExtensible w16cex:durableId="66A7F010" w16cex:dateUtc="2026-05-26T13:25:00Z">
     <w16cex:extLst>
       <w16:ext w16:uri="{CE6994B0-6A32-4C9F-8C6B-6E91EDA988CE}">
         <cr:reactions xmlns:cr="http://schemas.microsoft.com/office/comments/2020/reactions">
           <cr:reaction reactionType="1">
-            <cr:reactionInfo dateUtc="2026-05-26T13:31:07Z">
+            <cr:reactionInfo dateUtc="2026-06-03T09:38:29Z">
               <cr:user userId="S::davide.brugnoli@students.uniroma2.eu::00c05e8b-0e35-421e-bad9-6afeecc66b22" userProvider="AD" userName="davide brugnoli"/>
             </cr:reactionInfo>
           </cr:reaction>
@@ -9695,13 +9006,62 @@
       </w16:ext>
     </w16cex:extLst>
   </w16cex:commentExtensible>
-  <w16cex:commentExtensible w16cex:durableId="52A6E0D1" w16cex:dateUtc="2026-05-26T13:32:00Z"/>
-  <w16cex:commentExtensible w16cex:durableId="2282B6D7" w16cex:dateUtc="2026-04-30T10:11:00Z"/>
+  <w16cex:commentExtensible w16cex:durableId="643AFE80" w16cex:dateUtc="2026-05-26T13:28:00Z"/>
+  <w16cex:commentExtensible w16cex:durableId="1602E17F" w16cex:dateUtc="2026-06-01T15:52:00Z">
+    <w16cex:extLst>
+      <w16:ext w16:uri="{CE6994B0-6A32-4C9F-8C6B-6E91EDA988CE}">
+        <cr:reactions xmlns:cr="http://schemas.microsoft.com/office/comments/2020/reactions">
+          <cr:reaction reactionType="1">
+            <cr:reactionInfo dateUtc="2026-06-03T10:16:54Z">
+              <cr:user userId="S::davide.brugnoli@students.uniroma2.eu::00c05e8b-0e35-421e-bad9-6afeecc66b22" userProvider="AD" userName="davide brugnoli"/>
+            </cr:reactionInfo>
+          </cr:reaction>
+        </cr:reactions>
+      </w16:ext>
+    </w16cex:extLst>
+  </w16cex:commentExtensible>
+  <w16cex:commentExtensible w16cex:durableId="6D76DFA0" w16cex:dateUtc="2026-04-30T09:58:00Z">
+    <w16cex:extLst>
+      <w16:ext w16:uri="{CE6994B0-6A32-4C9F-8C6B-6E91EDA988CE}">
+        <cr:reactions xmlns:cr="http://schemas.microsoft.com/office/comments/2020/reactions">
+          <cr:reaction reactionType="1">
+            <cr:reactionInfo dateUtc="2026-06-03T10:16:53Z">
+              <cr:user userId="S::davide.brugnoli@students.uniroma2.eu::00c05e8b-0e35-421e-bad9-6afeecc66b22" userProvider="AD" userName="davide brugnoli"/>
+            </cr:reactionInfo>
+          </cr:reaction>
+        </cr:reactions>
+      </w16:ext>
+    </w16cex:extLst>
+  </w16cex:commentExtensible>
+  <w16cex:commentExtensible w16cex:durableId="4CCF2757" w16cex:dateUtc="2026-05-26T13:29:00Z"/>
+  <w16cex:commentExtensible w16cex:durableId="460C1592" w16cex:dateUtc="2026-06-03T10:18:00Z"/>
   <w16cex:commentExtensible w16cex:durableId="2EFD151C" w16cex:dateUtc="2026-04-30T10:11:00Z"/>
-  <w16cex:commentExtensible w16cex:durableId="33EF2EA6" w16cex:dateUtc="2026-04-30T10:15:00Z"/>
-  <w16cex:commentExtensible w16cex:durableId="29BDC699" w16cex:dateUtc="2026-06-03T09:04:00Z"/>
-  <w16cex:commentExtensible w16cex:durableId="6FA98D39" w16cex:dateUtc="2026-05-26T13:44:00Z"/>
-  <w16cex:commentExtensible w16cex:durableId="1DBF2124" w16cex:dateUtc="2026-05-26T13:45:00Z"/>
+  <w16cex:commentExtensible w16cex:durableId="33EF2EA6" w16cex:dateUtc="2026-04-30T10:15:00Z">
+    <w16cex:extLst>
+      <w16:ext w16:uri="{CE6994B0-6A32-4C9F-8C6B-6E91EDA988CE}">
+        <cr:reactions xmlns:cr="http://schemas.microsoft.com/office/comments/2020/reactions">
+          <cr:reaction reactionType="1">
+            <cr:reactionInfo dateUtc="2026-06-03T10:46:45Z">
+              <cr:user userId="S::davide.brugnoli@students.uniroma2.eu::00c05e8b-0e35-421e-bad9-6afeecc66b22" userProvider="AD" userName="davide brugnoli"/>
+            </cr:reactionInfo>
+          </cr:reaction>
+        </cr:reactions>
+      </w16:ext>
+    </w16cex:extLst>
+  </w16cex:commentExtensible>
+  <w16cex:commentExtensible w16cex:durableId="6FA98D39" w16cex:dateUtc="2026-05-26T13:44:00Z">
+    <w16cex:extLst>
+      <w16:ext w16:uri="{CE6994B0-6A32-4C9F-8C6B-6E91EDA988CE}">
+        <cr:reactions xmlns:cr="http://schemas.microsoft.com/office/comments/2020/reactions">
+          <cr:reaction reactionType="1">
+            <cr:reactionInfo dateUtc="2026-06-03T10:26:55Z">
+              <cr:user userId="S::davide.brugnoli@students.uniroma2.eu::00c05e8b-0e35-421e-bad9-6afeecc66b22" userProvider="AD" userName="davide brugnoli"/>
+            </cr:reactionInfo>
+          </cr:reaction>
+        </cr:reactions>
+      </w16:ext>
+    </w16cex:extLst>
+  </w16cex:commentExtensible>
   <w16cex:commentExtensible w16cex:durableId="1B4900E6" w16cex:dateUtc="2026-05-26T13:46:00Z"/>
   <w16cex:commentExtensible w16cex:durableId="2233859F" w16cex:dateUtc="2026-05-26T13:48:00Z"/>
   <w16cex:commentExtensible w16cex:durableId="08207586" w16cex:dateUtc="2026-05-26T13:53:00Z"/>
@@ -9721,14 +9081,10 @@
   <w16cid:commentId w16cid:paraId="2ECF85D9" w16cid:durableId="1602E17F"/>
   <w16cid:commentId w16cid:paraId="23F9DCC9" w16cid:durableId="6D76DFA0"/>
   <w16cid:commentId w16cid:paraId="36AB0C9D" w16cid:durableId="4CCF2757"/>
-  <w16cid:commentId w16cid:paraId="5A4F53AA" w16cid:durableId="3DC8BF16"/>
-  <w16cid:commentId w16cid:paraId="38391F09" w16cid:durableId="52A6E0D1"/>
-  <w16cid:commentId w16cid:paraId="43FA236F" w16cid:durableId="2282B6D7"/>
-  <w16cid:commentId w16cid:paraId="62075B69" w16cid:durableId="2EFD151C"/>
-  <w16cid:commentId w16cid:paraId="0BD793F5" w16cid:durableId="33EF2EA6"/>
-  <w16cid:commentId w16cid:paraId="56CDDAF6" w16cid:durableId="29BDC699"/>
+  <w16cid:commentId w16cid:paraId="1ABBCD74" w16cid:durableId="460C1592"/>
+  <w16cid:commentId w16cid:paraId="46443DE5" w16cid:durableId="2EFD151C"/>
+  <w16cid:commentId w16cid:paraId="2CA708E2" w16cid:durableId="33EF2EA6"/>
   <w16cid:commentId w16cid:paraId="47FB3CB4" w16cid:durableId="6FA98D39"/>
-  <w16cid:commentId w16cid:paraId="7D039CDD" w16cid:durableId="1DBF2124"/>
   <w16cid:commentId w16cid:paraId="61D113FC" w16cid:durableId="1B4900E6"/>
   <w16cid:commentId w16cid:paraId="0EB5BDA6" w16cid:durableId="2233859F"/>
   <w16cid:commentId w16cid:paraId="5D12BDB0" w16cid:durableId="08207586"/>
@@ -10308,6 +9664,119 @@
     </w:lvl>
   </w:abstractNum>
   <w:abstractNum w:abstractNumId="6" w15:restartNumberingAfterBreak="0">
+    <w:nsid w:val="47123FB3"/>
+    <w:multiLevelType w:val="hybridMultilevel"/>
+    <w:tmpl w:val="01C8D20C"/>
+    <w:lvl w:ilvl="0" w:tplc="04100001">
+      <w:start w:val="1"/>
+      <w:numFmt w:val="bullet"/>
+      <w:lvlText w:val=""/>
+      <w:lvlJc w:val="left"/>
+      <w:pPr>
+        <w:ind w:left="990" w:hanging="360"/>
+      </w:pPr>
+      <w:rPr>
+        <w:rFonts w:ascii="Symbol" w:hAnsi="Symbol" w:hint="default"/>
+      </w:rPr>
+    </w:lvl>
+    <w:lvl w:ilvl="1" w:tplc="04100003" w:tentative="1">
+      <w:start w:val="1"/>
+      <w:numFmt w:val="bullet"/>
+      <w:lvlText w:val="o"/>
+      <w:lvlJc w:val="left"/>
+      <w:pPr>
+        <w:ind w:left="1710" w:hanging="360"/>
+      </w:pPr>
+      <w:rPr>
+        <w:rFonts w:ascii="Courier New" w:hAnsi="Courier New" w:cs="Courier New" w:hint="default"/>
+      </w:rPr>
+    </w:lvl>
+    <w:lvl w:ilvl="2" w:tplc="04100005" w:tentative="1">
+      <w:start w:val="1"/>
+      <w:numFmt w:val="bullet"/>
+      <w:lvlText w:val=""/>
+      <w:lvlJc w:val="left"/>
+      <w:pPr>
+        <w:ind w:left="2430" w:hanging="360"/>
+      </w:pPr>
+      <w:rPr>
+        <w:rFonts w:ascii="Wingdings" w:hAnsi="Wingdings" w:hint="default"/>
+      </w:rPr>
+    </w:lvl>
+    <w:lvl w:ilvl="3" w:tplc="04100001" w:tentative="1">
+      <w:start w:val="1"/>
+      <w:numFmt w:val="bullet"/>
+      <w:lvlText w:val=""/>
+      <w:lvlJc w:val="left"/>
+      <w:pPr>
+        <w:ind w:left="3150" w:hanging="360"/>
+      </w:pPr>
+      <w:rPr>
+        <w:rFonts w:ascii="Symbol" w:hAnsi="Symbol" w:hint="default"/>
+      </w:rPr>
+    </w:lvl>
+    <w:lvl w:ilvl="4" w:tplc="04100003" w:tentative="1">
+      <w:start w:val="1"/>
+      <w:numFmt w:val="bullet"/>
+      <w:lvlText w:val="o"/>
+      <w:lvlJc w:val="left"/>
+      <w:pPr>
+        <w:ind w:left="3870" w:hanging="360"/>
+      </w:pPr>
+      <w:rPr>
+        <w:rFonts w:ascii="Courier New" w:hAnsi="Courier New" w:cs="Courier New" w:hint="default"/>
+      </w:rPr>
+    </w:lvl>
+    <w:lvl w:ilvl="5" w:tplc="04100005" w:tentative="1">
+      <w:start w:val="1"/>
+      <w:numFmt w:val="bullet"/>
+      <w:lvlText w:val=""/>
+      <w:lvlJc w:val="left"/>
+      <w:pPr>
+        <w:ind w:left="4590" w:hanging="360"/>
+      </w:pPr>
+      <w:rPr>
+        <w:rFonts w:ascii="Wingdings" w:hAnsi="Wingdings" w:hint="default"/>
+      </w:rPr>
+    </w:lvl>
+    <w:lvl w:ilvl="6" w:tplc="04100001" w:tentative="1">
+      <w:start w:val="1"/>
+      <w:numFmt w:val="bullet"/>
+      <w:lvlText w:val=""/>
+      <w:lvlJc w:val="left"/>
+      <w:pPr>
+        <w:ind w:left="5310" w:hanging="360"/>
+      </w:pPr>
+      <w:rPr>
+        <w:rFonts w:ascii="Symbol" w:hAnsi="Symbol" w:hint="default"/>
+      </w:rPr>
+    </w:lvl>
+    <w:lvl w:ilvl="7" w:tplc="04100003" w:tentative="1">
+      <w:start w:val="1"/>
+      <w:numFmt w:val="bullet"/>
+      <w:lvlText w:val="o"/>
+      <w:lvlJc w:val="left"/>
+      <w:pPr>
+        <w:ind w:left="6030" w:hanging="360"/>
+      </w:pPr>
+      <w:rPr>
+        <w:rFonts w:ascii="Courier New" w:hAnsi="Courier New" w:cs="Courier New" w:hint="default"/>
+      </w:rPr>
+    </w:lvl>
+    <w:lvl w:ilvl="8" w:tplc="04100005" w:tentative="1">
+      <w:start w:val="1"/>
+      <w:numFmt w:val="bullet"/>
+      <w:lvlText w:val=""/>
+      <w:lvlJc w:val="left"/>
+      <w:pPr>
+        <w:ind w:left="6750" w:hanging="360"/>
+      </w:pPr>
+      <w:rPr>
+        <w:rFonts w:ascii="Wingdings" w:hAnsi="Wingdings" w:hint="default"/>
+      </w:rPr>
+    </w:lvl>
+  </w:abstractNum>
+  <w:abstractNum w:abstractNumId="7" w15:restartNumberingAfterBreak="0">
     <w:nsid w:val="511F4A98"/>
     <w:multiLevelType w:val="hybridMultilevel"/>
     <w:tmpl w:val="CD20C822"/>
@@ -10361,7 +9830,7 @@
       <w:lvlJc w:val="left"/>
     </w:lvl>
   </w:abstractNum>
-  <w:abstractNum w:abstractNumId="7" w15:restartNumberingAfterBreak="0">
+  <w:abstractNum w:abstractNumId="8" w15:restartNumberingAfterBreak="0">
     <w:nsid w:val="5F212F29"/>
     <w:multiLevelType w:val="hybridMultilevel"/>
     <w:tmpl w:val="CF42D75A"/>
@@ -10415,7 +9884,7 @@
       <w:lvlJc w:val="left"/>
     </w:lvl>
   </w:abstractNum>
-  <w:abstractNum w:abstractNumId="8" w15:restartNumberingAfterBreak="0">
+  <w:abstractNum w:abstractNumId="9" w15:restartNumberingAfterBreak="0">
     <w:nsid w:val="61E42511"/>
     <w:multiLevelType w:val="hybridMultilevel"/>
     <w:tmpl w:val="FBF2F5B2"/>
@@ -10473,7 +9942,7 @@
       <w:lvlJc w:val="left"/>
     </w:lvl>
   </w:abstractNum>
-  <w:abstractNum w:abstractNumId="9" w15:restartNumberingAfterBreak="0">
+  <w:abstractNum w:abstractNumId="10" w15:restartNumberingAfterBreak="0">
     <w:nsid w:val="668260F9"/>
     <w:multiLevelType w:val="hybridMultilevel"/>
     <w:tmpl w:val="F35CA7F8"/>
@@ -10534,10 +10003,10 @@
     </w:lvlOverride>
   </w:num>
   <w:num w:numId="2" w16cid:durableId="451941836">
-    <w:abstractNumId w:val="8"/>
+    <w:abstractNumId w:val="9"/>
   </w:num>
   <w:num w:numId="3" w16cid:durableId="2136605697">
-    <w:abstractNumId w:val="6"/>
+    <w:abstractNumId w:val="7"/>
     <w:lvlOverride w:ilvl="0">
       <w:startOverride w:val="1"/>
     </w:lvlOverride>
@@ -10549,7 +10018,7 @@
     </w:lvlOverride>
   </w:num>
   <w:num w:numId="5" w16cid:durableId="1468235036">
-    <w:abstractNumId w:val="7"/>
+    <w:abstractNumId w:val="8"/>
     <w:lvlOverride w:ilvl="0">
       <w:startOverride w:val="1"/>
     </w:lvlOverride>
@@ -10561,7 +10030,7 @@
     </w:lvlOverride>
   </w:num>
   <w:num w:numId="7" w16cid:durableId="1469588351">
-    <w:abstractNumId w:val="9"/>
+    <w:abstractNumId w:val="10"/>
     <w:lvlOverride w:ilvl="0">
       <w:startOverride w:val="1"/>
     </w:lvlOverride>
@@ -10573,10 +10042,13 @@
     </w:lvlOverride>
   </w:num>
   <w:num w:numId="9" w16cid:durableId="417554421">
-    <w:abstractNumId w:val="8"/>
+    <w:abstractNumId w:val="9"/>
   </w:num>
   <w:num w:numId="10" w16cid:durableId="1368675583">
     <w:abstractNumId w:val="0"/>
+  </w:num>
+  <w:num w:numId="11" w16cid:durableId="1558588470">
+    <w:abstractNumId w:val="6"/>
   </w:num>
 </w:numbering>
 </file>
@@ -10983,6 +10455,7 @@
   <w:style w:type="paragraph" w:default="1" w:styleId="Normal">
     <w:name w:val="Normal"/>
     <w:qFormat/>
+    <w:rsid w:val="00AF5956"/>
   </w:style>
   <w:style w:type="paragraph" w:styleId="Heading1">
     <w:name w:val="heading 1"/>
@@ -11078,7 +10551,6 @@
   <w:style w:type="character" w:default="1" w:styleId="DefaultParagraphFont">
     <w:name w:val="Default Paragraph Font"/>
     <w:uiPriority w:val="1"/>
-    <w:semiHidden/>
     <w:unhideWhenUsed/>
   </w:style>
   <w:style w:type="table" w:default="1" w:styleId="TableNormal">

</xml_diff>